<commit_message>
Versión final con todo ya funcional
</commit_message>
<xml_diff>
--- a/doc/individual.docx
+++ b/doc/individual.docx
@@ -1,6 +1,6 @@
 
 <file path=word/document.xml><?xml version="1.0" encoding="utf-8"?>
-<w:document xmlns:wpc="http://schemas.microsoft.com/office/word/2010/wordprocessingCanvas" xmlns:cx="http://schemas.microsoft.com/office/drawing/2014/chartex" xmlns:cx1="http://schemas.microsoft.com/office/drawing/2015/9/8/chartex" xmlns:cx2="http://schemas.microsoft.com/office/drawing/2015/10/21/chartex" xmlns:cx3="http://schemas.microsoft.com/office/drawing/2016/5/9/chartex" xmlns:cx4="http://schemas.microsoft.com/office/drawing/2016/5/10/chartex" xmlns:cx5="http://schemas.microsoft.com/office/drawing/2016/5/11/chartex" xmlns:cx6="http://schemas.microsoft.com/office/drawing/2016/5/12/chartex" xmlns:cx7="http://schemas.microsoft.com/office/drawing/2016/5/13/chartex" xmlns:cx8="http://schemas.microsoft.com/office/drawing/2016/5/14/chartex" xmlns:mc="http://schemas.openxmlformats.org/markup-compatibility/2006" xmlns:aink="http://schemas.microsoft.com/office/drawing/2016/ink" xmlns:am3d="http://schemas.microsoft.com/office/drawing/2017/model3d" xmlns:o="urn:schemas-microsoft-com:office:office" xmlns:r="http://schemas.openxmlformats.org/officeDocument/2006/relationships" xmlns:m="http://schemas.openxmlformats.org/officeDocument/2006/math" xmlns:v="urn:schemas-microsoft-com:vml" xmlns:wp14="http://schemas.microsoft.com/office/word/2010/wordprocessingDrawing" xmlns:wp="http://schemas.openxmlformats.org/drawingml/2006/wordprocessingDrawing" xmlns:w10="urn:schemas-microsoft-com:office:word" xmlns:w="http://schemas.openxmlformats.org/wordprocessingml/2006/main" xmlns:w14="http://schemas.microsoft.com/office/word/2010/wordml" xmlns:w15="http://schemas.microsoft.com/office/word/2012/wordml" xmlns:w16cid="http://schemas.microsoft.com/office/word/2016/wordml/cid" xmlns:w16se="http://schemas.microsoft.com/office/word/2015/wordml/symex" xmlns:wpg="http://schemas.microsoft.com/office/word/2010/wordprocessingGroup" xmlns:wpi="http://schemas.microsoft.com/office/word/2010/wordprocessingInk" xmlns:wne="http://schemas.microsoft.com/office/word/2006/wordml" xmlns:wps="http://schemas.microsoft.com/office/word/2010/wordprocessingShape" mc:Ignorable="w14 w15 w16se w16cid wp14">
+<w:document xmlns:wpc="http://schemas.microsoft.com/office/word/2010/wordprocessingCanvas" xmlns:cx="http://schemas.microsoft.com/office/drawing/2014/chartex" xmlns:cx1="http://schemas.microsoft.com/office/drawing/2015/9/8/chartex" xmlns:cx2="http://schemas.microsoft.com/office/drawing/2015/10/21/chartex" xmlns:cx3="http://schemas.microsoft.com/office/drawing/2016/5/9/chartex" xmlns:cx4="http://schemas.microsoft.com/office/drawing/2016/5/10/chartex" xmlns:cx5="http://schemas.microsoft.com/office/drawing/2016/5/11/chartex" xmlns:cx6="http://schemas.microsoft.com/office/drawing/2016/5/12/chartex" xmlns:cx7="http://schemas.microsoft.com/office/drawing/2016/5/13/chartex" xmlns:cx8="http://schemas.microsoft.com/office/drawing/2016/5/14/chartex" xmlns:mc="http://schemas.openxmlformats.org/markup-compatibility/2006" xmlns:aink="http://schemas.microsoft.com/office/drawing/2016/ink" xmlns:am3d="http://schemas.microsoft.com/office/drawing/2017/model3d" xmlns:o="urn:schemas-microsoft-com:office:office" xmlns:oel="http://schemas.microsoft.com/office/2019/extlst" xmlns:r="http://schemas.openxmlformats.org/officeDocument/2006/relationships" xmlns:m="http://schemas.openxmlformats.org/officeDocument/2006/math" xmlns:v="urn:schemas-microsoft-com:vml" xmlns:wp14="http://schemas.microsoft.com/office/word/2010/wordprocessingDrawing" xmlns:wp="http://schemas.openxmlformats.org/drawingml/2006/wordprocessingDrawing" xmlns:w10="urn:schemas-microsoft-com:office:word" xmlns:w="http://schemas.openxmlformats.org/wordprocessingml/2006/main" xmlns:w14="http://schemas.microsoft.com/office/word/2010/wordml" xmlns:w15="http://schemas.microsoft.com/office/word/2012/wordml" xmlns:w16cex="http://schemas.microsoft.com/office/word/2018/wordml/cex" xmlns:w16cid="http://schemas.microsoft.com/office/word/2016/wordml/cid" xmlns:w16="http://schemas.microsoft.com/office/word/2018/wordml" xmlns:w16du="http://schemas.microsoft.com/office/word/2023/wordml/word16du" xmlns:w16sdtdh="http://schemas.microsoft.com/office/word/2020/wordml/sdtdatahash" xmlns:w16sdtfl="http://schemas.microsoft.com/office/word/2024/wordml/sdtformatlock" xmlns:w16se="http://schemas.microsoft.com/office/word/2015/wordml/symex" xmlns:wpg="http://schemas.microsoft.com/office/word/2010/wordprocessingGroup" xmlns:wpi="http://schemas.microsoft.com/office/word/2010/wordprocessingInk" xmlns:wne="http://schemas.microsoft.com/office/word/2006/wordml" xmlns:wps="http://schemas.microsoft.com/office/word/2010/wordprocessingShape" mc:Ignorable="w14 w15 w16se w16cid w16 w16cex w16sdtdh w16sdtfl w16du wp14">
   <w:body>
     <w:p>
       <w:r>
@@ -76,9 +76,9 @@
                               <w:tblLook w:val="0000" w:firstRow="0" w:lastRow="0" w:firstColumn="0" w:lastColumn="0" w:noHBand="0" w:noVBand="0"/>
                             </w:tblPr>
                             <w:tblGrid>
-                              <w:gridCol w:w="2965"/>
-                              <w:gridCol w:w="5885"/>
-                              <w:gridCol w:w="2196"/>
+                              <w:gridCol w:w="2969"/>
+                              <w:gridCol w:w="5893"/>
+                              <w:gridCol w:w="2199"/>
                             </w:tblGrid>
                             <w:tr>
                               <w:trPr>
@@ -223,23 +223,7 @@
                                       <w:sz w:val="19"/>
                                       <w:szCs w:val="19"/>
                                     </w:rPr>
-                                    <w:t>{</w:t>
-                                  </w:r>
-                                  <w:proofErr w:type="spellStart"/>
-                                  <w:r>
-                                    <w:rPr>
-                                      <w:sz w:val="19"/>
-                                      <w:szCs w:val="19"/>
-                                    </w:rPr>
-                                    <w:t>Codigo</w:t>
-                                  </w:r>
-                                  <w:proofErr w:type="spellEnd"/>
-                                  <w:r>
-                                    <w:rPr>
-                                      <w:sz w:val="19"/>
-                                      <w:szCs w:val="19"/>
-                                    </w:rPr>
-                                    <w:t>}</w:t>
+                                    <w:t>{Codigo}</w:t>
                                   </w:r>
                                 </w:p>
                                 <w:p>
@@ -358,17 +342,7 @@
                                       <w:sz w:val="19"/>
                                       <w:szCs w:val="19"/>
                                     </w:rPr>
-                                    <w:t>{</w:t>
-                                  </w:r>
-                                  <w:proofErr w:type="spellStart"/>
-                                  <w:r>
-                                    <w:rPr>
-                                      <w:rFonts w:ascii="Arial" w:hAnsi="Arial"/>
-                                      <w:b/>
-                                      <w:sz w:val="19"/>
-                                      <w:szCs w:val="19"/>
-                                    </w:rPr>
-                                    <w:t>Nombre</w:t>
+                                    <w:t>{Nombre</w:t>
                                   </w:r>
                                   <w:r>
                                     <w:rPr>
@@ -379,7 +353,6 @@
                                     </w:rPr>
                                     <w:t>sC</w:t>
                                   </w:r>
-                                  <w:proofErr w:type="spellEnd"/>
                                   <w:r>
                                     <w:rPr>
                                       <w:rFonts w:ascii="Arial" w:hAnsi="Arial"/>
@@ -427,27 +400,7 @@
                                       <w:sz w:val="19"/>
                                       <w:szCs w:val="19"/>
                                     </w:rPr>
-                                    <w:t>{</w:t>
-                                  </w:r>
-                                  <w:proofErr w:type="spellStart"/>
-                                  <w:r>
-                                    <w:rPr>
-                                      <w:rFonts w:ascii="Arial" w:hAnsi="Arial"/>
-                                      <w:b/>
-                                      <w:sz w:val="19"/>
-                                      <w:szCs w:val="19"/>
-                                    </w:rPr>
-                                    <w:t>CarreraDocente</w:t>
-                                  </w:r>
-                                  <w:proofErr w:type="spellEnd"/>
-                                  <w:r>
-                                    <w:rPr>
-                                      <w:rFonts w:ascii="Arial" w:hAnsi="Arial"/>
-                                      <w:b/>
-                                      <w:sz w:val="19"/>
-                                      <w:szCs w:val="19"/>
-                                    </w:rPr>
-                                    <w:t>}</w:t>
+                                    <w:t>{CarreraDocente}</w:t>
                                   </w:r>
                                 </w:p>
                                 <w:p>
@@ -520,7 +473,7 @@
                 <v:stroke joinstyle="miter"/>
                 <v:path gradientshapeok="t" o:connecttype="rect"/>
               </v:shapetype>
-              <v:shape id="ctc1" o:spid="_x0000_s1026" type="#_x0000_t202" style="position:absolute;margin-left:0;margin-top:-28.35pt;width:595.3pt;height:127.55pt;z-index:251662336;visibility:visible;mso-wrap-style:square;mso-width-percent:0;mso-height-percent:0;mso-wrap-distance-left:9pt;mso-wrap-distance-top:0;mso-wrap-distance-right:9pt;mso-wrap-distance-bottom:0;mso-position-horizontal:center;mso-position-horizontal-relative:page;mso-position-vertical:absolute;mso-position-vertical-relative:margin;mso-width-percent:0;mso-height-percent:0;mso-width-relative:margin;mso-height-relative:margin;v-text-anchor:top" o:gfxdata="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" o:allowoverlap="f" fillcolor="white [3201]" stroked="f" strokeweight=".5pt">
+              <v:shape id="ctc1" o:spid="_x0000_s1026" type="#_x0000_t202" style="position:absolute;margin-left:0;margin-top:-28.35pt;width:595.3pt;height:127.55pt;z-index:251662336;visibility:visible;mso-wrap-style:square;mso-width-percent:0;mso-height-percent:0;mso-wrap-distance-left:9pt;mso-wrap-distance-top:0;mso-wrap-distance-right:9pt;mso-wrap-distance-bottom:0;mso-position-horizontal:center;mso-position-horizontal-relative:page;mso-position-vertical:absolute;mso-position-vertical-relative:margin;mso-width-percent:0;mso-height-percent:0;mso-width-relative:margin;mso-height-relative:margin;v-text-anchor:top" o:gfxdata="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" o:allowoverlap="f" fillcolor="white [3201]" stroked="f" strokeweight=".5pt">
                 <v:textbox>
                   <w:txbxContent>
                     <w:tbl>
@@ -542,9 +495,9 @@
                         <w:tblLook w:val="0000" w:firstRow="0" w:lastRow="0" w:firstColumn="0" w:lastColumn="0" w:noHBand="0" w:noVBand="0"/>
                       </w:tblPr>
                       <w:tblGrid>
-                        <w:gridCol w:w="2965"/>
-                        <w:gridCol w:w="5885"/>
-                        <w:gridCol w:w="2196"/>
+                        <w:gridCol w:w="2969"/>
+                        <w:gridCol w:w="5893"/>
+                        <w:gridCol w:w="2199"/>
                       </w:tblGrid>
                       <w:tr>
                         <w:trPr>
@@ -689,23 +642,7 @@
                                 <w:sz w:val="19"/>
                                 <w:szCs w:val="19"/>
                               </w:rPr>
-                              <w:t>{</w:t>
-                            </w:r>
-                            <w:proofErr w:type="spellStart"/>
-                            <w:r>
-                              <w:rPr>
-                                <w:sz w:val="19"/>
-                                <w:szCs w:val="19"/>
-                              </w:rPr>
-                              <w:t>Codigo</w:t>
-                            </w:r>
-                            <w:proofErr w:type="spellEnd"/>
-                            <w:r>
-                              <w:rPr>
-                                <w:sz w:val="19"/>
-                                <w:szCs w:val="19"/>
-                              </w:rPr>
-                              <w:t>}</w:t>
+                              <w:t>{Codigo}</w:t>
                             </w:r>
                           </w:p>
                           <w:p>
@@ -824,17 +761,7 @@
                                 <w:sz w:val="19"/>
                                 <w:szCs w:val="19"/>
                               </w:rPr>
-                              <w:t>{</w:t>
-                            </w:r>
-                            <w:proofErr w:type="spellStart"/>
-                            <w:r>
-                              <w:rPr>
-                                <w:rFonts w:ascii="Arial" w:hAnsi="Arial"/>
-                                <w:b/>
-                                <w:sz w:val="19"/>
-                                <w:szCs w:val="19"/>
-                              </w:rPr>
-                              <w:t>Nombre</w:t>
+                              <w:t>{Nombre</w:t>
                             </w:r>
                             <w:r>
                               <w:rPr>
@@ -845,7 +772,6 @@
                               </w:rPr>
                               <w:t>sC</w:t>
                             </w:r>
-                            <w:proofErr w:type="spellEnd"/>
                             <w:r>
                               <w:rPr>
                                 <w:rFonts w:ascii="Arial" w:hAnsi="Arial"/>
@@ -893,27 +819,7 @@
                                 <w:sz w:val="19"/>
                                 <w:szCs w:val="19"/>
                               </w:rPr>
-                              <w:t>{</w:t>
-                            </w:r>
-                            <w:proofErr w:type="spellStart"/>
-                            <w:r>
-                              <w:rPr>
-                                <w:rFonts w:ascii="Arial" w:hAnsi="Arial"/>
-                                <w:b/>
-                                <w:sz w:val="19"/>
-                                <w:szCs w:val="19"/>
-                              </w:rPr>
-                              <w:t>CarreraDocente</w:t>
-                            </w:r>
-                            <w:proofErr w:type="spellEnd"/>
-                            <w:r>
-                              <w:rPr>
-                                <w:rFonts w:ascii="Arial" w:hAnsi="Arial"/>
-                                <w:b/>
-                                <w:sz w:val="19"/>
-                                <w:szCs w:val="19"/>
-                              </w:rPr>
-                              <w:t>}</w:t>
+                              <w:t>{CarreraDocente}</w:t>
                             </w:r>
                           </w:p>
                           <w:p>
@@ -1117,27 +1023,7 @@
                                 <w:sz w:val="30"/>
                                 <w:szCs w:val="30"/>
                               </w:rPr>
-                              <w:t>Docente: {</w:t>
-                            </w:r>
-                            <w:proofErr w:type="spellStart"/>
-                            <w:r>
-                              <w:rPr>
-                                <w:b/>
-                                <w:bCs/>
-                                <w:sz w:val="30"/>
-                                <w:szCs w:val="30"/>
-                              </w:rPr>
-                              <w:t>Nombresc</w:t>
-                            </w:r>
-                            <w:proofErr w:type="spellEnd"/>
-                            <w:r>
-                              <w:rPr>
-                                <w:b/>
-                                <w:bCs/>
-                                <w:sz w:val="30"/>
-                                <w:szCs w:val="30"/>
-                              </w:rPr>
-                              <w:t>}</w:t>
+                              <w:t>Docente: {Nombresc}</w:t>
                             </w:r>
                           </w:p>
                           <w:p>
@@ -1158,27 +1044,7 @@
                                 <w:sz w:val="30"/>
                                 <w:szCs w:val="30"/>
                               </w:rPr>
-                              <w:t>Carrera: {</w:t>
-                            </w:r>
-                            <w:proofErr w:type="spellStart"/>
-                            <w:r>
-                              <w:rPr>
-                                <w:b/>
-                                <w:bCs/>
-                                <w:sz w:val="30"/>
-                                <w:szCs w:val="30"/>
-                              </w:rPr>
-                              <w:t>Carreradocente</w:t>
-                            </w:r>
-                            <w:proofErr w:type="spellEnd"/>
-                            <w:r>
-                              <w:rPr>
-                                <w:b/>
-                                <w:bCs/>
-                                <w:sz w:val="30"/>
-                                <w:szCs w:val="30"/>
-                              </w:rPr>
-                              <w:t>}</w:t>
+                              <w:t>Carrera: {Carreradocente}</w:t>
                             </w:r>
                           </w:p>
                         </w:txbxContent>
@@ -1203,7 +1069,7 @@
           </mc:Choice>
           <mc:Fallback>
             <w:pict>
-              <v:shape w14:anchorId="335592B0" id="Cuadro de texto 1" o:spid="_x0000_s1027" type="#_x0000_t202" style="position:absolute;margin-left:544.05pt;margin-top:18.7pt;width:595.25pt;height:190pt;z-index:251660288;visibility:visible;mso-wrap-style:square;mso-width-percent:0;mso-height-percent:0;mso-wrap-distance-left:9pt;mso-wrap-distance-top:0;mso-wrap-distance-right:9pt;mso-wrap-distance-bottom:0;mso-position-horizontal:right;mso-position-horizontal-relative:page;mso-position-vertical:absolute;mso-position-vertical-relative:text;mso-width-percent:0;mso-height-percent:0;mso-width-relative:margin;mso-height-relative:margin;v-text-anchor:top" o:gfxdata="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" filled="f" stroked="f">
+              <v:shape w14:anchorId="335592B0" id="Cuadro de texto 1" o:spid="_x0000_s1027" type="#_x0000_t202" style="position:absolute;margin-left:544.05pt;margin-top:18.7pt;width:595.25pt;height:190pt;z-index:251660288;visibility:visible;mso-wrap-style:square;mso-width-percent:0;mso-height-percent:0;mso-wrap-distance-left:9pt;mso-wrap-distance-top:0;mso-wrap-distance-right:9pt;mso-wrap-distance-bottom:0;mso-position-horizontal:right;mso-position-horizontal-relative:page;mso-position-vertical:absolute;mso-position-vertical-relative:text;mso-width-percent:0;mso-height-percent:0;mso-width-relative:margin;mso-height-relative:margin;v-text-anchor:top" o:gfxdata="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" filled="f" stroked="f">
                 <v:textbox>
                   <w:txbxContent>
                     <w:p>
@@ -1284,27 +1150,7 @@
                           <w:sz w:val="30"/>
                           <w:szCs w:val="30"/>
                         </w:rPr>
-                        <w:t>Docente: {</w:t>
-                      </w:r>
-                      <w:proofErr w:type="spellStart"/>
-                      <w:r>
-                        <w:rPr>
-                          <w:b/>
-                          <w:bCs/>
-                          <w:sz w:val="30"/>
-                          <w:szCs w:val="30"/>
-                        </w:rPr>
-                        <w:t>Nombresc</w:t>
-                      </w:r>
-                      <w:proofErr w:type="spellEnd"/>
-                      <w:r>
-                        <w:rPr>
-                          <w:b/>
-                          <w:bCs/>
-                          <w:sz w:val="30"/>
-                          <w:szCs w:val="30"/>
-                        </w:rPr>
-                        <w:t>}</w:t>
+                        <w:t>Docente: {Nombresc}</w:t>
                       </w:r>
                     </w:p>
                     <w:p>
@@ -1325,27 +1171,7 @@
                           <w:sz w:val="30"/>
                           <w:szCs w:val="30"/>
                         </w:rPr>
-                        <w:t>Carrera: {</w:t>
-                      </w:r>
-                      <w:proofErr w:type="spellStart"/>
-                      <w:r>
-                        <w:rPr>
-                          <w:b/>
-                          <w:bCs/>
-                          <w:sz w:val="30"/>
-                          <w:szCs w:val="30"/>
-                        </w:rPr>
-                        <w:t>Carreradocente</w:t>
-                      </w:r>
-                      <w:proofErr w:type="spellEnd"/>
-                      <w:r>
-                        <w:rPr>
-                          <w:b/>
-                          <w:bCs/>
-                          <w:sz w:val="30"/>
-                          <w:szCs w:val="30"/>
-                        </w:rPr>
-                        <w:t>}</w:t>
+                        <w:t>Carrera: {Carreradocente}</w:t>
                       </w:r>
                     </w:p>
                   </w:txbxContent>
@@ -1357,22 +1183,6 @@
         </mc:AlternateContent>
       </w:r>
     </w:p>
-    <w:p/>
-    <w:p/>
-    <w:p/>
-    <w:p/>
-    <w:p/>
-    <w:p/>
-    <w:p/>
-    <w:p/>
-    <w:p/>
-    <w:p/>
-    <w:p/>
-    <w:p/>
-    <w:p/>
-    <w:p/>
-    <w:p/>
-    <w:p/>
     <w:p/>
     <w:p/>
     <w:p/>
@@ -1406,17 +1216,17 @@
         <mc:AlternateContent>
           <mc:Choice Requires="wps">
             <w:drawing>
-              <wp:anchor distT="0" distB="0" distL="114300" distR="114300" simplePos="0" relativeHeight="251664384" behindDoc="0" locked="1" layoutInCell="1" allowOverlap="0" wp14:anchorId="74A8DB5E" wp14:editId="0CF4946C">
+              <wp:anchor distT="0" distB="0" distL="114300" distR="114300" simplePos="0" relativeHeight="251664384" behindDoc="1" locked="1" layoutInCell="1" allowOverlap="1" wp14:anchorId="4CEDEC3C" wp14:editId="5E8C8D91">
                 <wp:simplePos x="0" y="0"/>
-                <wp:positionH relativeFrom="margin">
-                  <wp:posOffset>-736600</wp:posOffset>
+                <wp:positionH relativeFrom="page">
+                  <wp:posOffset>213360</wp:posOffset>
                 </wp:positionH>
-                <wp:positionV relativeFrom="margin">
-                  <wp:posOffset>7560945</wp:posOffset>
+                <wp:positionV relativeFrom="page">
+                  <wp:posOffset>7795260</wp:posOffset>
                 </wp:positionV>
                 <wp:extent cx="7200000" cy="1800000"/>
                 <wp:effectExtent l="0" t="0" r="1270" b="0"/>
-                <wp:wrapNone/>
+                <wp:wrapTopAndBottom/>
                 <wp:docPr id="1181547154" name="ctc1"/>
                 <wp:cNvGraphicFramePr/>
                 <a:graphic xmlns:a="http://schemas.openxmlformats.org/drawingml/2006/main">
@@ -1452,7 +1262,7 @@
                           <w:tbl>
                             <w:tblPr>
                               <w:tblStyle w:val="TableNormal"/>
-                              <w:tblW w:w="9505" w:type="dxa"/>
+                              <w:tblW w:w="4986" w:type="pct"/>
                               <w:jc w:val="center"/>
                               <w:tblBorders>
                                 <w:top w:val="single" w:sz="4" w:space="0" w:color="000000"/>
@@ -1462,12 +1272,12 @@
                                 <w:insideH w:val="single" w:sz="4" w:space="0" w:color="000000"/>
                                 <w:insideV w:val="single" w:sz="4" w:space="0" w:color="000000"/>
                               </w:tblBorders>
-                              <w:tblLayout w:type="fixed"/>
                               <w:tblLook w:val="01E0" w:firstRow="1" w:lastRow="1" w:firstColumn="1" w:lastColumn="1" w:noHBand="0" w:noVBand="0"/>
                             </w:tblPr>
                             <w:tblGrid>
-                              <w:gridCol w:w="4790"/>
-                              <w:gridCol w:w="4715"/>
+                              <w:gridCol w:w="3252"/>
+                              <w:gridCol w:w="3973"/>
+                              <w:gridCol w:w="3789"/>
                             </w:tblGrid>
                             <w:tr>
                               <w:trPr>
@@ -1476,7 +1286,7 @@
                               </w:trPr>
                               <w:tc>
                                 <w:tcPr>
-                                  <w:tcW w:w="4790" w:type="dxa"/>
+                                  <w:tcW w:w="1476" w:type="pct"/>
                                 </w:tcPr>
                                 <w:p>
                                   <w:pPr>
@@ -1539,7 +1349,32 @@
                               </w:tc>
                               <w:tc>
                                 <w:tcPr>
-                                  <w:tcW w:w="4715" w:type="dxa"/>
+                                  <w:tcW w:w="1803" w:type="pct"/>
+                                </w:tcPr>
+                                <w:p>
+                                  <w:pPr>
+                                    <w:pStyle w:val="TableParagraph"/>
+                                    <w:spacing w:before="1"/>
+                                    <w:jc w:val="center"/>
+                                    <w:rPr>
+                                      <w:rFonts w:ascii="Arial" w:hAnsi="Arial" w:cs="Arial"/>
+                                      <w:sz w:val="18"/>
+                                      <w:szCs w:val="18"/>
+                                    </w:rPr>
+                                  </w:pPr>
+                                  <w:r>
+                                    <w:rPr>
+                                      <w:rFonts w:ascii="Arial" w:hAnsi="Arial" w:cs="Arial"/>
+                                      <w:sz w:val="18"/>
+                                      <w:szCs w:val="18"/>
+                                    </w:rPr>
+                                    <w:t>Revisado Por:</w:t>
+                                  </w:r>
+                                </w:p>
+                              </w:tc>
+                              <w:tc>
+                                <w:tcPr>
+                                  <w:tcW w:w="1720" w:type="pct"/>
                                 </w:tcPr>
                                 <w:p>
                                   <w:pPr>
@@ -1570,7 +1405,7 @@
                               </w:trPr>
                               <w:tc>
                                 <w:tcPr>
-                                  <w:tcW w:w="4790" w:type="dxa"/>
+                                  <w:tcW w:w="1476" w:type="pct"/>
                                 </w:tcPr>
                                 <w:p>
                                   <w:pPr>
@@ -1590,16 +1425,7 @@
                                       <w:sz w:val="18"/>
                                       <w:szCs w:val="18"/>
                                     </w:rPr>
-                                    <w:t>NOMBRE</w:t>
-                                  </w:r>
-                                  <w:r>
-                                    <w:rPr>
-                                      <w:rFonts w:ascii="Arial" w:hAnsi="Arial" w:cs="Arial"/>
-                                      <w:b/>
-                                      <w:sz w:val="18"/>
-                                      <w:szCs w:val="18"/>
-                                    </w:rPr>
-                                    <w:t>:</w:t>
+                                    <w:t>NOMBRE:</w:t>
                                   </w:r>
                                   <w:r>
                                     <w:rPr>
@@ -1619,8 +1445,6 @@
                                     </w:rPr>
                                     <w:t>{</w:t>
                                   </w:r>
-                                  <w:bookmarkStart w:id="1" w:name="_GoBack"/>
-                                  <w:bookmarkEnd w:id="1"/>
                                   <w:proofErr w:type="spellStart"/>
                                   <w:r>
                                     <w:rPr>
@@ -1643,7 +1467,54 @@
                               </w:tc>
                               <w:tc>
                                 <w:tcPr>
-                                  <w:tcW w:w="4715" w:type="dxa"/>
+                                  <w:tcW w:w="1803" w:type="pct"/>
+                                </w:tcPr>
+                                <w:p>
+                                  <w:pPr>
+                                    <w:pStyle w:val="TableParagraph"/>
+                                    <w:spacing w:before="40"/>
+                                    <w:ind w:left="81"/>
+                                    <w:rPr>
+                                      <w:rFonts w:ascii="Arial" w:hAnsi="Arial" w:cs="Arial"/>
+                                      <w:b/>
+                                      <w:sz w:val="18"/>
+                                      <w:szCs w:val="18"/>
+                                    </w:rPr>
+                                  </w:pPr>
+                                  <w:r>
+                                    <w:rPr>
+                                      <w:rFonts w:ascii="Arial" w:hAnsi="Arial" w:cs="Arial"/>
+                                      <w:b/>
+                                      <w:sz w:val="18"/>
+                                      <w:szCs w:val="18"/>
+                                    </w:rPr>
+                                    <w:t>NOMBRE:</w:t>
+                                  </w:r>
+                                  <w:r>
+                                    <w:rPr>
+                                      <w:rFonts w:ascii="Arial" w:hAnsi="Arial" w:cs="Arial"/>
+                                      <w:b/>
+                                      <w:spacing w:val="-1"/>
+                                      <w:sz w:val="18"/>
+                                      <w:szCs w:val="18"/>
+                                    </w:rPr>
+                                    <w:t xml:space="preserve"> </w:t>
+                                  </w:r>
+                                  <w:r>
+                                    <w:rPr>
+                                      <w:rFonts w:ascii="Arial" w:hAnsi="Arial" w:cs="Arial"/>
+                                      <w:b/>
+                                      <w:spacing w:val="-1"/>
+                                      <w:sz w:val="18"/>
+                                      <w:szCs w:val="18"/>
+                                    </w:rPr>
+                                    <w:t>Alex León T.</w:t>
+                                  </w:r>
+                                </w:p>
+                              </w:tc>
+                              <w:tc>
+                                <w:tcPr>
+                                  <w:tcW w:w="1720" w:type="pct"/>
                                 </w:tcPr>
                                 <w:p>
                                   <w:pPr>
@@ -1663,16 +1534,7 @@
                                       <w:sz w:val="18"/>
                                       <w:szCs w:val="18"/>
                                     </w:rPr>
-                                    <w:t>NOMBRE</w:t>
-                                  </w:r>
-                                  <w:r>
-                                    <w:rPr>
-                                      <w:rFonts w:ascii="Arial" w:hAnsi="Arial" w:cs="Arial"/>
-                                      <w:b/>
-                                      <w:sz w:val="18"/>
-                                      <w:szCs w:val="18"/>
-                                    </w:rPr>
-                                    <w:t>:</w:t>
+                                    <w:t>NOMBRE:</w:t>
                                   </w:r>
                                   <w:r>
                                     <w:rPr>
@@ -1692,59 +1554,7 @@
                                       <w:sz w:val="18"/>
                                       <w:szCs w:val="18"/>
                                     </w:rPr>
-                                    <w:t xml:space="preserve"> </w:t>
-                                  </w:r>
-                                  <w:r>
-                                    <w:rPr>
-                                      <w:rFonts w:ascii="Arial" w:hAnsi="Arial" w:cs="Arial"/>
-                                      <w:b/>
-                                      <w:spacing w:val="-1"/>
-                                      <w:sz w:val="18"/>
-                                      <w:szCs w:val="18"/>
-                                    </w:rPr>
-                                    <w:t>Villar</w:t>
-                                  </w:r>
-                                  <w:r>
-                                    <w:rPr>
-                                      <w:rFonts w:ascii="Arial" w:hAnsi="Arial" w:cs="Arial"/>
-                                      <w:b/>
-                                      <w:spacing w:val="-1"/>
-                                      <w:sz w:val="18"/>
-                                      <w:szCs w:val="18"/>
-                                    </w:rPr>
-                                    <w:t>r</w:t>
-                                  </w:r>
-                                  <w:r>
-                                    <w:rPr>
-                                      <w:rFonts w:ascii="Arial" w:hAnsi="Arial" w:cs="Arial"/>
-                                      <w:b/>
-                                      <w:spacing w:val="-1"/>
-                                      <w:sz w:val="18"/>
-                                      <w:szCs w:val="18"/>
-                                    </w:rPr>
-                                    <w:t xml:space="preserve">eal </w:t>
-                                  </w:r>
-                                  <w:proofErr w:type="spellStart"/>
-                                  <w:r>
-                                    <w:rPr>
-                                      <w:rFonts w:ascii="Arial" w:hAnsi="Arial" w:cs="Arial"/>
-                                      <w:b/>
-                                      <w:spacing w:val="-1"/>
-                                      <w:sz w:val="18"/>
-                                      <w:szCs w:val="18"/>
-                                    </w:rPr>
-                                    <w:t>Enriquez</w:t>
-                                  </w:r>
-                                  <w:proofErr w:type="spellEnd"/>
-                                  <w:r>
-                                    <w:rPr>
-                                      <w:rFonts w:ascii="Arial" w:hAnsi="Arial" w:cs="Arial"/>
-                                      <w:b/>
-                                      <w:spacing w:val="-1"/>
-                                      <w:sz w:val="18"/>
-                                      <w:szCs w:val="18"/>
-                                    </w:rPr>
-                                    <w:t xml:space="preserve"> Jefferson Edgar</w:t>
+                                    <w:t xml:space="preserve"> Villarreal Enriquez Jefferson Edgar</w:t>
                                   </w:r>
                                 </w:p>
                               </w:tc>
@@ -1756,7 +1566,7 @@
                               </w:trPr>
                               <w:tc>
                                 <w:tcPr>
-                                  <w:tcW w:w="4790" w:type="dxa"/>
+                                  <w:tcW w:w="1476" w:type="pct"/>
                                   <w:vAlign w:val="center"/>
                                 </w:tcPr>
                                 <w:p>
@@ -1792,16 +1602,7 @@
                                       <w:sz w:val="18"/>
                                       <w:szCs w:val="18"/>
                                     </w:rPr>
-                                    <w:t>CARGO</w:t>
-                                  </w:r>
-                                  <w:r>
-                                    <w:rPr>
-                                      <w:rFonts w:ascii="Arial" w:hAnsi="Arial" w:cs="Arial"/>
-                                      <w:b/>
-                                      <w:sz w:val="18"/>
-                                      <w:szCs w:val="18"/>
-                                    </w:rPr>
-                                    <w:t>:</w:t>
+                                    <w:t>CARGO:</w:t>
                                   </w:r>
                                   <w:r>
                                     <w:rPr>
@@ -1837,7 +1638,7 @@
                               </w:tc>
                               <w:tc>
                                 <w:tcPr>
-                                  <w:tcW w:w="4715" w:type="dxa"/>
+                                  <w:tcW w:w="1803" w:type="pct"/>
                                   <w:vAlign w:val="center"/>
                                 </w:tcPr>
                                 <w:p>
@@ -1859,7 +1660,7 @@
                                       <w:sz w:val="18"/>
                                       <w:szCs w:val="18"/>
                                     </w:rPr>
-                                    <w:t>CARGO</w:t>
+                                    <w:t>CARGO:</w:t>
                                   </w:r>
                                   <w:r>
                                     <w:rPr>
@@ -1868,7 +1669,45 @@
                                       <w:sz w:val="18"/>
                                       <w:szCs w:val="18"/>
                                     </w:rPr>
-                                    <w:t>:</w:t>
+                                    <w:t xml:space="preserve"> </w:t>
+                                  </w:r>
+                                  <w:proofErr w:type="spellStart"/>
+                                  <w:r>
+                                    <w:rPr>
+                                      <w:rFonts w:ascii="Arial" w:hAnsi="Arial" w:cs="Arial"/>
+                                      <w:sz w:val="18"/>
+                                      <w:szCs w:val="18"/>
+                                    </w:rPr>
+                                    <w:t>Vicerreptor</w:t>
+                                  </w:r>
+                                  <w:proofErr w:type="spellEnd"/>
+                                </w:p>
+                              </w:tc>
+                              <w:tc>
+                                <w:tcPr>
+                                  <w:tcW w:w="1720" w:type="pct"/>
+                                  <w:vAlign w:val="center"/>
+                                </w:tcPr>
+                                <w:p>
+                                  <w:pPr>
+                                    <w:pStyle w:val="TableParagraph"/>
+                                    <w:spacing w:line="184" w:lineRule="exact"/>
+                                    <w:ind w:left="81" w:right="201"/>
+                                    <w:rPr>
+                                      <w:rFonts w:ascii="Arial" w:hAnsi="Arial" w:cs="Arial"/>
+                                      <w:b/>
+                                      <w:sz w:val="18"/>
+                                      <w:szCs w:val="18"/>
+                                    </w:rPr>
+                                  </w:pPr>
+                                  <w:r>
+                                    <w:rPr>
+                                      <w:rFonts w:ascii="Arial" w:hAnsi="Arial" w:cs="Arial"/>
+                                      <w:b/>
+                                      <w:sz w:val="18"/>
+                                      <w:szCs w:val="18"/>
+                                    </w:rPr>
+                                    <w:t>CARGO:</w:t>
                                   </w:r>
                                   <w:r>
                                     <w:rPr>
@@ -1885,23 +1724,7 @@
                                       <w:sz w:val="18"/>
                                       <w:szCs w:val="18"/>
                                     </w:rPr>
-                                    <w:t xml:space="preserve">Gestor </w:t>
-                                  </w:r>
-                                  <w:r>
-                                    <w:rPr>
-                                      <w:rFonts w:ascii="Arial" w:hAnsi="Arial" w:cs="Arial"/>
-                                      <w:sz w:val="18"/>
-                                      <w:szCs w:val="18"/>
-                                    </w:rPr>
-                                    <w:t xml:space="preserve">De </w:t>
-                                  </w:r>
-                                  <w:r>
-                                    <w:rPr>
-                                      <w:rFonts w:ascii="Arial" w:hAnsi="Arial" w:cs="Arial"/>
-                                      <w:sz w:val="18"/>
-                                      <w:szCs w:val="18"/>
-                                    </w:rPr>
-                                    <w:t>Procesos Académicos</w:t>
+                                    <w:t>Gestor De Procesos Académicos</w:t>
                                   </w:r>
                                 </w:p>
                               </w:tc>
@@ -1931,13 +1754,13 @@
           </mc:Choice>
           <mc:Fallback>
             <w:pict>
-              <v:shape w14:anchorId="74A8DB5E" id="_x0000_s1028" type="#_x0000_t202" style="position:absolute;margin-left:-58pt;margin-top:595.35pt;width:566.95pt;height:141.75pt;z-index:251664384;visibility:visible;mso-wrap-style:square;mso-width-percent:0;mso-height-percent:0;mso-wrap-distance-left:9pt;mso-wrap-distance-top:0;mso-wrap-distance-right:9pt;mso-wrap-distance-bottom:0;mso-position-horizontal:absolute;mso-position-horizontal-relative:margin;mso-position-vertical:absolute;mso-position-vertical-relative:margin;mso-width-percent:0;mso-height-percent:0;mso-width-relative:margin;mso-height-relative:margin;v-text-anchor:top" o:gfxdata="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" o:allowoverlap="f" fillcolor="white [3201]" stroked="f" strokeweight=".5pt">
+              <v:shape w14:anchorId="4CEDEC3C" id="_x0000_s1028" type="#_x0000_t202" style="position:absolute;margin-left:16.8pt;margin-top:613.8pt;width:566.95pt;height:141.75pt;z-index:-251652096;visibility:visible;mso-wrap-style:square;mso-width-percent:0;mso-height-percent:0;mso-wrap-distance-left:9pt;mso-wrap-distance-top:0;mso-wrap-distance-right:9pt;mso-wrap-distance-bottom:0;mso-position-horizontal:absolute;mso-position-horizontal-relative:page;mso-position-vertical:absolute;mso-position-vertical-relative:page;mso-width-percent:0;mso-height-percent:0;mso-width-relative:margin;mso-height-relative:margin;v-text-anchor:top" o:gfxdata="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" fillcolor="white [3201]" stroked="f" strokeweight=".5pt">
                 <v:textbox>
                   <w:txbxContent>
                     <w:tbl>
                       <w:tblPr>
                         <w:tblStyle w:val="TableNormal"/>
-                        <w:tblW w:w="9505" w:type="dxa"/>
+                        <w:tblW w:w="4986" w:type="pct"/>
                         <w:jc w:val="center"/>
                         <w:tblBorders>
                           <w:top w:val="single" w:sz="4" w:space="0" w:color="000000"/>
@@ -1947,12 +1770,12 @@
                           <w:insideH w:val="single" w:sz="4" w:space="0" w:color="000000"/>
                           <w:insideV w:val="single" w:sz="4" w:space="0" w:color="000000"/>
                         </w:tblBorders>
-                        <w:tblLayout w:type="fixed"/>
                         <w:tblLook w:val="01E0" w:firstRow="1" w:lastRow="1" w:firstColumn="1" w:lastColumn="1" w:noHBand="0" w:noVBand="0"/>
                       </w:tblPr>
                       <w:tblGrid>
-                        <w:gridCol w:w="4790"/>
-                        <w:gridCol w:w="4715"/>
+                        <w:gridCol w:w="3252"/>
+                        <w:gridCol w:w="3973"/>
+                        <w:gridCol w:w="3789"/>
                       </w:tblGrid>
                       <w:tr>
                         <w:trPr>
@@ -1961,7 +1784,7 @@
                         </w:trPr>
                         <w:tc>
                           <w:tcPr>
-                            <w:tcW w:w="4790" w:type="dxa"/>
+                            <w:tcW w:w="1476" w:type="pct"/>
                           </w:tcPr>
                           <w:p>
                             <w:pPr>
@@ -1974,7 +1797,7 @@
                                 <w:szCs w:val="18"/>
                               </w:rPr>
                             </w:pPr>
-                            <w:bookmarkStart w:id="2" w:name="_Hlk168652179"/>
+                            <w:bookmarkStart w:id="1" w:name="_Hlk168652179"/>
                             <w:r>
                               <w:rPr>
                                 <w:rFonts w:ascii="Arial" w:hAnsi="Arial" w:cs="Arial"/>
@@ -2024,7 +1847,32 @@
                         </w:tc>
                         <w:tc>
                           <w:tcPr>
-                            <w:tcW w:w="4715" w:type="dxa"/>
+                            <w:tcW w:w="1803" w:type="pct"/>
+                          </w:tcPr>
+                          <w:p>
+                            <w:pPr>
+                              <w:pStyle w:val="TableParagraph"/>
+                              <w:spacing w:before="1"/>
+                              <w:jc w:val="center"/>
+                              <w:rPr>
+                                <w:rFonts w:ascii="Arial" w:hAnsi="Arial" w:cs="Arial"/>
+                                <w:sz w:val="18"/>
+                                <w:szCs w:val="18"/>
+                              </w:rPr>
+                            </w:pPr>
+                            <w:r>
+                              <w:rPr>
+                                <w:rFonts w:ascii="Arial" w:hAnsi="Arial" w:cs="Arial"/>
+                                <w:sz w:val="18"/>
+                                <w:szCs w:val="18"/>
+                              </w:rPr>
+                              <w:t>Revisado Por:</w:t>
+                            </w:r>
+                          </w:p>
+                        </w:tc>
+                        <w:tc>
+                          <w:tcPr>
+                            <w:tcW w:w="1720" w:type="pct"/>
                           </w:tcPr>
                           <w:p>
                             <w:pPr>
@@ -2055,7 +1903,7 @@
                         </w:trPr>
                         <w:tc>
                           <w:tcPr>
-                            <w:tcW w:w="4790" w:type="dxa"/>
+                            <w:tcW w:w="1476" w:type="pct"/>
                           </w:tcPr>
                           <w:p>
                             <w:pPr>
@@ -2075,16 +1923,7 @@
                                 <w:sz w:val="18"/>
                                 <w:szCs w:val="18"/>
                               </w:rPr>
-                              <w:t>NOMBRE</w:t>
-                            </w:r>
-                            <w:r>
-                              <w:rPr>
-                                <w:rFonts w:ascii="Arial" w:hAnsi="Arial" w:cs="Arial"/>
-                                <w:b/>
-                                <w:sz w:val="18"/>
-                                <w:szCs w:val="18"/>
-                              </w:rPr>
-                              <w:t>:</w:t>
+                              <w:t>NOMBRE:</w:t>
                             </w:r>
                             <w:r>
                               <w:rPr>
@@ -2104,8 +1943,6 @@
                               </w:rPr>
                               <w:t>{</w:t>
                             </w:r>
-                            <w:bookmarkStart w:id="3" w:name="_GoBack"/>
-                            <w:bookmarkEnd w:id="3"/>
                             <w:proofErr w:type="spellStart"/>
                             <w:r>
                               <w:rPr>
@@ -2128,7 +1965,54 @@
                         </w:tc>
                         <w:tc>
                           <w:tcPr>
-                            <w:tcW w:w="4715" w:type="dxa"/>
+                            <w:tcW w:w="1803" w:type="pct"/>
+                          </w:tcPr>
+                          <w:p>
+                            <w:pPr>
+                              <w:pStyle w:val="TableParagraph"/>
+                              <w:spacing w:before="40"/>
+                              <w:ind w:left="81"/>
+                              <w:rPr>
+                                <w:rFonts w:ascii="Arial" w:hAnsi="Arial" w:cs="Arial"/>
+                                <w:b/>
+                                <w:sz w:val="18"/>
+                                <w:szCs w:val="18"/>
+                              </w:rPr>
+                            </w:pPr>
+                            <w:r>
+                              <w:rPr>
+                                <w:rFonts w:ascii="Arial" w:hAnsi="Arial" w:cs="Arial"/>
+                                <w:b/>
+                                <w:sz w:val="18"/>
+                                <w:szCs w:val="18"/>
+                              </w:rPr>
+                              <w:t>NOMBRE:</w:t>
+                            </w:r>
+                            <w:r>
+                              <w:rPr>
+                                <w:rFonts w:ascii="Arial" w:hAnsi="Arial" w:cs="Arial"/>
+                                <w:b/>
+                                <w:spacing w:val="-1"/>
+                                <w:sz w:val="18"/>
+                                <w:szCs w:val="18"/>
+                              </w:rPr>
+                              <w:t xml:space="preserve"> </w:t>
+                            </w:r>
+                            <w:r>
+                              <w:rPr>
+                                <w:rFonts w:ascii="Arial" w:hAnsi="Arial" w:cs="Arial"/>
+                                <w:b/>
+                                <w:spacing w:val="-1"/>
+                                <w:sz w:val="18"/>
+                                <w:szCs w:val="18"/>
+                              </w:rPr>
+                              <w:t>Alex León T.</w:t>
+                            </w:r>
+                          </w:p>
+                        </w:tc>
+                        <w:tc>
+                          <w:tcPr>
+                            <w:tcW w:w="1720" w:type="pct"/>
                           </w:tcPr>
                           <w:p>
                             <w:pPr>
@@ -2148,16 +2032,7 @@
                                 <w:sz w:val="18"/>
                                 <w:szCs w:val="18"/>
                               </w:rPr>
-                              <w:t>NOMBRE</w:t>
-                            </w:r>
-                            <w:r>
-                              <w:rPr>
-                                <w:rFonts w:ascii="Arial" w:hAnsi="Arial" w:cs="Arial"/>
-                                <w:b/>
-                                <w:sz w:val="18"/>
-                                <w:szCs w:val="18"/>
-                              </w:rPr>
-                              <w:t>:</w:t>
+                              <w:t>NOMBRE:</w:t>
                             </w:r>
                             <w:r>
                               <w:rPr>
@@ -2177,59 +2052,7 @@
                                 <w:sz w:val="18"/>
                                 <w:szCs w:val="18"/>
                               </w:rPr>
-                              <w:t xml:space="preserve"> </w:t>
-                            </w:r>
-                            <w:r>
-                              <w:rPr>
-                                <w:rFonts w:ascii="Arial" w:hAnsi="Arial" w:cs="Arial"/>
-                                <w:b/>
-                                <w:spacing w:val="-1"/>
-                                <w:sz w:val="18"/>
-                                <w:szCs w:val="18"/>
-                              </w:rPr>
-                              <w:t>Villar</w:t>
-                            </w:r>
-                            <w:r>
-                              <w:rPr>
-                                <w:rFonts w:ascii="Arial" w:hAnsi="Arial" w:cs="Arial"/>
-                                <w:b/>
-                                <w:spacing w:val="-1"/>
-                                <w:sz w:val="18"/>
-                                <w:szCs w:val="18"/>
-                              </w:rPr>
-                              <w:t>r</w:t>
-                            </w:r>
-                            <w:r>
-                              <w:rPr>
-                                <w:rFonts w:ascii="Arial" w:hAnsi="Arial" w:cs="Arial"/>
-                                <w:b/>
-                                <w:spacing w:val="-1"/>
-                                <w:sz w:val="18"/>
-                                <w:szCs w:val="18"/>
-                              </w:rPr>
-                              <w:t xml:space="preserve">eal </w:t>
-                            </w:r>
-                            <w:proofErr w:type="spellStart"/>
-                            <w:r>
-                              <w:rPr>
-                                <w:rFonts w:ascii="Arial" w:hAnsi="Arial" w:cs="Arial"/>
-                                <w:b/>
-                                <w:spacing w:val="-1"/>
-                                <w:sz w:val="18"/>
-                                <w:szCs w:val="18"/>
-                              </w:rPr>
-                              <w:t>Enriquez</w:t>
-                            </w:r>
-                            <w:proofErr w:type="spellEnd"/>
-                            <w:r>
-                              <w:rPr>
-                                <w:rFonts w:ascii="Arial" w:hAnsi="Arial" w:cs="Arial"/>
-                                <w:b/>
-                                <w:spacing w:val="-1"/>
-                                <w:sz w:val="18"/>
-                                <w:szCs w:val="18"/>
-                              </w:rPr>
-                              <w:t xml:space="preserve"> Jefferson Edgar</w:t>
+                              <w:t xml:space="preserve"> Villarreal Enriquez Jefferson Edgar</w:t>
                             </w:r>
                           </w:p>
                         </w:tc>
@@ -2241,7 +2064,7 @@
                         </w:trPr>
                         <w:tc>
                           <w:tcPr>
-                            <w:tcW w:w="4790" w:type="dxa"/>
+                            <w:tcW w:w="1476" w:type="pct"/>
                             <w:vAlign w:val="center"/>
                           </w:tcPr>
                           <w:p>
@@ -2277,16 +2100,7 @@
                                 <w:sz w:val="18"/>
                                 <w:szCs w:val="18"/>
                               </w:rPr>
-                              <w:t>CARGO</w:t>
-                            </w:r>
-                            <w:r>
-                              <w:rPr>
-                                <w:rFonts w:ascii="Arial" w:hAnsi="Arial" w:cs="Arial"/>
-                                <w:b/>
-                                <w:sz w:val="18"/>
-                                <w:szCs w:val="18"/>
-                              </w:rPr>
-                              <w:t>:</w:t>
+                              <w:t>CARGO:</w:t>
                             </w:r>
                             <w:r>
                               <w:rPr>
@@ -2322,7 +2136,7 @@
                         </w:tc>
                         <w:tc>
                           <w:tcPr>
-                            <w:tcW w:w="4715" w:type="dxa"/>
+                            <w:tcW w:w="1803" w:type="pct"/>
                             <w:vAlign w:val="center"/>
                           </w:tcPr>
                           <w:p>
@@ -2344,7 +2158,7 @@
                                 <w:sz w:val="18"/>
                                 <w:szCs w:val="18"/>
                               </w:rPr>
-                              <w:t>CARGO</w:t>
+                              <w:t>CARGO:</w:t>
                             </w:r>
                             <w:r>
                               <w:rPr>
@@ -2353,7 +2167,45 @@
                                 <w:sz w:val="18"/>
                                 <w:szCs w:val="18"/>
                               </w:rPr>
-                              <w:t>:</w:t>
+                              <w:t xml:space="preserve"> </w:t>
+                            </w:r>
+                            <w:proofErr w:type="spellStart"/>
+                            <w:r>
+                              <w:rPr>
+                                <w:rFonts w:ascii="Arial" w:hAnsi="Arial" w:cs="Arial"/>
+                                <w:sz w:val="18"/>
+                                <w:szCs w:val="18"/>
+                              </w:rPr>
+                              <w:t>Vicerreptor</w:t>
+                            </w:r>
+                            <w:proofErr w:type="spellEnd"/>
+                          </w:p>
+                        </w:tc>
+                        <w:tc>
+                          <w:tcPr>
+                            <w:tcW w:w="1720" w:type="pct"/>
+                            <w:vAlign w:val="center"/>
+                          </w:tcPr>
+                          <w:p>
+                            <w:pPr>
+                              <w:pStyle w:val="TableParagraph"/>
+                              <w:spacing w:line="184" w:lineRule="exact"/>
+                              <w:ind w:left="81" w:right="201"/>
+                              <w:rPr>
+                                <w:rFonts w:ascii="Arial" w:hAnsi="Arial" w:cs="Arial"/>
+                                <w:b/>
+                                <w:sz w:val="18"/>
+                                <w:szCs w:val="18"/>
+                              </w:rPr>
+                            </w:pPr>
+                            <w:r>
+                              <w:rPr>
+                                <w:rFonts w:ascii="Arial" w:hAnsi="Arial" w:cs="Arial"/>
+                                <w:b/>
+                                <w:sz w:val="18"/>
+                                <w:szCs w:val="18"/>
+                              </w:rPr>
+                              <w:t>CARGO:</w:t>
                             </w:r>
                             <w:r>
                               <w:rPr>
@@ -2370,33 +2222,17 @@
                                 <w:sz w:val="18"/>
                                 <w:szCs w:val="18"/>
                               </w:rPr>
-                              <w:t xml:space="preserve">Gestor </w:t>
-                            </w:r>
-                            <w:r>
-                              <w:rPr>
-                                <w:rFonts w:ascii="Arial" w:hAnsi="Arial" w:cs="Arial"/>
-                                <w:sz w:val="18"/>
-                                <w:szCs w:val="18"/>
-                              </w:rPr>
-                              <w:t xml:space="preserve">De </w:t>
-                            </w:r>
-                            <w:r>
-                              <w:rPr>
-                                <w:rFonts w:ascii="Arial" w:hAnsi="Arial" w:cs="Arial"/>
-                                <w:sz w:val="18"/>
-                                <w:szCs w:val="18"/>
-                              </w:rPr>
-                              <w:t>Procesos Académicos</w:t>
+                              <w:t>Gestor De Procesos Académicos</w:t>
                             </w:r>
                           </w:p>
                         </w:tc>
                       </w:tr>
-                      <w:bookmarkEnd w:id="2"/>
+                      <w:bookmarkEnd w:id="1"/>
                     </w:tbl>
                     <w:p/>
                   </w:txbxContent>
                 </v:textbox>
-                <w10:wrap anchorx="margin" anchory="margin"/>
+                <w10:wrap type="topAndBottom" anchorx="page" anchory="page"/>
                 <w10:anchorlock/>
               </v:shape>
             </w:pict>
@@ -2404,10 +2240,6 @@
         </mc:AlternateContent>
       </w:r>
     </w:p>
-    <w:p/>
-    <w:p/>
-    <w:p/>
-    <w:p/>
     <w:p/>
     <w:tbl>
       <w:tblPr>
@@ -2753,6 +2585,7 @@
                 <w:sz w:val="18"/>
                 <w:szCs w:val="18"/>
               </w:rPr>
+              <w:lastRenderedPageBreak/>
               <w:t>Claustro Docente</w:t>
             </w:r>
           </w:p>
@@ -3072,7 +2905,7 @@
       </w:tr>
       <w:tr>
         <w:trPr>
-          <w:trHeight w:val="5130"/>
+          <w:trHeight w:val="4072"/>
         </w:trPr>
         <w:tc>
           <w:tcPr>
@@ -3992,275 +3825,9 @@
               </w:rPr>
             </w:pPr>
           </w:p>
-          <w:p>
-            <w:pPr>
-              <w:rPr>
-                <w:sz w:val="18"/>
-                <w:szCs w:val="18"/>
-              </w:rPr>
-            </w:pPr>
-            <w:r>
-              <w:rPr>
-                <w:sz w:val="16"/>
-              </w:rPr>
-              <w:t>Este</w:t>
-            </w:r>
-            <w:r>
-              <w:rPr>
-                <w:spacing w:val="22"/>
-                <w:sz w:val="16"/>
-              </w:rPr>
-              <w:t xml:space="preserve"> </w:t>
-            </w:r>
-            <w:r>
-              <w:rPr>
-                <w:sz w:val="16"/>
-              </w:rPr>
-              <w:t>patrocinio</w:t>
-            </w:r>
-            <w:r>
-              <w:rPr>
-                <w:spacing w:val="22"/>
-                <w:sz w:val="16"/>
-              </w:rPr>
-              <w:t xml:space="preserve"> </w:t>
-            </w:r>
-            <w:r>
-              <w:rPr>
-                <w:sz w:val="16"/>
-              </w:rPr>
-              <w:t>asegura</w:t>
-            </w:r>
-            <w:r>
-              <w:rPr>
-                <w:spacing w:val="22"/>
-                <w:sz w:val="16"/>
-              </w:rPr>
-              <w:t xml:space="preserve"> </w:t>
-            </w:r>
-            <w:r>
-              <w:rPr>
-                <w:sz w:val="16"/>
-              </w:rPr>
-              <w:t>que</w:t>
-            </w:r>
-            <w:r>
-              <w:rPr>
-                <w:spacing w:val="22"/>
-                <w:sz w:val="16"/>
-              </w:rPr>
-              <w:t xml:space="preserve"> </w:t>
-            </w:r>
-            <w:r>
-              <w:rPr>
-                <w:sz w:val="16"/>
-              </w:rPr>
-              <w:t>los</w:t>
-            </w:r>
-            <w:r>
-              <w:rPr>
-                <w:spacing w:val="22"/>
-                <w:sz w:val="16"/>
-              </w:rPr>
-              <w:t xml:space="preserve"> </w:t>
-            </w:r>
-            <w:r>
-              <w:rPr>
-                <w:sz w:val="16"/>
-              </w:rPr>
-              <w:t>docentes</w:t>
-            </w:r>
-            <w:r>
-              <w:rPr>
-                <w:spacing w:val="22"/>
-                <w:sz w:val="16"/>
-              </w:rPr>
-              <w:t xml:space="preserve"> </w:t>
-            </w:r>
-            <w:r>
-              <w:rPr>
-                <w:sz w:val="16"/>
-              </w:rPr>
-              <w:t>cuenten</w:t>
-            </w:r>
-            <w:r>
-              <w:rPr>
-                <w:spacing w:val="22"/>
-                <w:sz w:val="16"/>
-              </w:rPr>
-              <w:t xml:space="preserve"> </w:t>
-            </w:r>
-            <w:r>
-              <w:rPr>
-                <w:sz w:val="16"/>
-              </w:rPr>
-              <w:t>con</w:t>
-            </w:r>
-            <w:r>
-              <w:rPr>
-                <w:spacing w:val="22"/>
-                <w:sz w:val="16"/>
-              </w:rPr>
-              <w:t xml:space="preserve"> </w:t>
-            </w:r>
-            <w:r>
-              <w:rPr>
-                <w:sz w:val="16"/>
-              </w:rPr>
-              <w:t>el</w:t>
-            </w:r>
-            <w:r>
-              <w:rPr>
-                <w:spacing w:val="22"/>
-                <w:sz w:val="16"/>
-              </w:rPr>
-              <w:t xml:space="preserve"> </w:t>
-            </w:r>
-            <w:r>
-              <w:rPr>
-                <w:sz w:val="16"/>
-              </w:rPr>
-              <w:t>respaldo</w:t>
-            </w:r>
-            <w:r>
-              <w:rPr>
-                <w:spacing w:val="22"/>
-                <w:sz w:val="16"/>
-              </w:rPr>
-              <w:t xml:space="preserve"> </w:t>
-            </w:r>
-            <w:r>
-              <w:rPr>
-                <w:sz w:val="16"/>
-              </w:rPr>
-              <w:t>necesario</w:t>
-            </w:r>
-            <w:r>
-              <w:rPr>
-                <w:spacing w:val="22"/>
-                <w:sz w:val="16"/>
-              </w:rPr>
-              <w:t xml:space="preserve"> </w:t>
-            </w:r>
-            <w:r>
-              <w:rPr>
-                <w:sz w:val="16"/>
-              </w:rPr>
-              <w:t>para</w:t>
-            </w:r>
-            <w:r>
-              <w:rPr>
-                <w:spacing w:val="22"/>
-                <w:sz w:val="16"/>
-              </w:rPr>
-              <w:t xml:space="preserve"> </w:t>
-            </w:r>
-            <w:r>
-              <w:rPr>
-                <w:sz w:val="16"/>
-              </w:rPr>
-              <w:t>su</w:t>
-            </w:r>
-            <w:r>
-              <w:rPr>
-                <w:spacing w:val="22"/>
-                <w:sz w:val="16"/>
-              </w:rPr>
-              <w:t xml:space="preserve"> </w:t>
-            </w:r>
-            <w:r>
-              <w:rPr>
-                <w:sz w:val="16"/>
-              </w:rPr>
-              <w:t>crecimiento</w:t>
-            </w:r>
-            <w:r>
-              <w:rPr>
-                <w:spacing w:val="22"/>
-                <w:sz w:val="16"/>
-              </w:rPr>
-              <w:t xml:space="preserve"> </w:t>
-            </w:r>
-            <w:r>
-              <w:rPr>
-                <w:sz w:val="16"/>
-              </w:rPr>
-              <w:t>profesional</w:t>
-            </w:r>
-            <w:r>
-              <w:rPr>
-                <w:spacing w:val="22"/>
-                <w:sz w:val="16"/>
-              </w:rPr>
-              <w:t xml:space="preserve"> </w:t>
-            </w:r>
-            <w:r>
-              <w:rPr>
-                <w:sz w:val="16"/>
-              </w:rPr>
-              <w:t>y</w:t>
-            </w:r>
-            <w:r>
-              <w:rPr>
-                <w:spacing w:val="22"/>
-                <w:sz w:val="16"/>
-              </w:rPr>
-              <w:t xml:space="preserve"> </w:t>
-            </w:r>
-            <w:r>
-              <w:rPr>
-                <w:sz w:val="16"/>
-              </w:rPr>
-              <w:t>el</w:t>
-            </w:r>
-            <w:r>
-              <w:rPr>
-                <w:spacing w:val="22"/>
-                <w:sz w:val="16"/>
-              </w:rPr>
-              <w:t xml:space="preserve"> </w:t>
-            </w:r>
-            <w:r>
-              <w:rPr>
-                <w:sz w:val="16"/>
-              </w:rPr>
-              <w:t>desarrollo</w:t>
-            </w:r>
-            <w:r>
-              <w:rPr>
-                <w:spacing w:val="22"/>
-                <w:sz w:val="16"/>
-              </w:rPr>
-              <w:t xml:space="preserve"> </w:t>
-            </w:r>
-            <w:r>
-              <w:rPr>
-                <w:sz w:val="16"/>
-              </w:rPr>
-              <w:t>de</w:t>
-            </w:r>
-            <w:r>
-              <w:rPr>
-                <w:spacing w:val="22"/>
-                <w:sz w:val="16"/>
-              </w:rPr>
-              <w:t xml:space="preserve"> </w:t>
-            </w:r>
-            <w:r>
-              <w:rPr>
-                <w:sz w:val="16"/>
-              </w:rPr>
-              <w:t>sus competencias, beneficiando tanto al docente como a la institución</w:t>
-            </w:r>
-          </w:p>
         </w:tc>
       </w:tr>
     </w:tbl>
-    <w:p/>
-    <w:p/>
-    <w:p/>
-    <w:p/>
-    <w:p/>
     <w:p/>
     <w:tbl>
       <w:tblPr>
@@ -4296,7 +3863,6 @@
                 <w:sz w:val="18"/>
                 <w:szCs w:val="18"/>
               </w:rPr>
-              <w:lastRenderedPageBreak/>
               <w:t>Capacitaciones Docente</w:t>
             </w:r>
           </w:p>
@@ -5402,7 +4968,21 @@
                     <w:rPr>
                       <w:sz w:val="16"/>
                     </w:rPr>
-                    <w:t>Se realiza inmediatamente después de concluir la capacitación y mide el cumplimiento de los objetivos de aprendizaje, el nivel de satisfacción de los participantes, y la aplicabilidad de los conocimientos adquiridos. Se basa en indicadores cuantitativos como la participación activa, el uso de recursos tecnológicos, y la efectividad de las metodologías</w:t>
+                    <w:t xml:space="preserve">Se realiza inmediatamente después de concluir la capacitación y mide el cumplimiento de los objetivos de aprendizaje, el nivel de satisfacción de los participantes, y la aplicabilidad de los conocimientos adquiridos. Se basa en indicadores cuantitativos como la </w:t>
+                  </w:r>
+                  <w:proofErr w:type="gramStart"/>
+                  <w:r>
+                    <w:rPr>
+                      <w:sz w:val="16"/>
+                    </w:rPr>
+                    <w:t>participación activa</w:t>
+                  </w:r>
+                  <w:proofErr w:type="gramEnd"/>
+                  <w:r>
+                    <w:rPr>
+                      <w:sz w:val="16"/>
+                    </w:rPr>
+                    <w:t>, el uso de recursos tecnológicos, y la efectividad de las metodologías</w:t>
                   </w:r>
                   <w:r>
                     <w:rPr>
@@ -6746,25 +6326,7 @@
                       <w:b/>
                       <w:sz w:val="18"/>
                     </w:rPr>
-                    <w:t>{#</w:t>
-                  </w:r>
-                  <w:proofErr w:type="spellStart"/>
-                  <w:r>
-                    <w:rPr>
-                      <w:rFonts w:ascii="Arial"/>
-                      <w:b/>
-                      <w:sz w:val="18"/>
-                    </w:rPr>
-                    <w:t>Teoria</w:t>
-                  </w:r>
-                  <w:proofErr w:type="spellEnd"/>
-                  <w:r>
-                    <w:rPr>
-                      <w:rFonts w:ascii="Arial"/>
-                      <w:b/>
-                      <w:sz w:val="18"/>
-                    </w:rPr>
-                    <w:t>}</w:t>
+                    <w:t>{#Teoria}</w:t>
                   </w:r>
                 </w:p>
                 <w:p>
@@ -7154,7 +6716,7 @@
       </w:tr>
       <w:tr>
         <w:trPr>
-          <w:trHeight w:val="7738"/>
+          <w:trHeight w:val="5510"/>
           <w:jc w:val="center"/>
         </w:trPr>
         <w:tc>
@@ -7553,7 +7115,7 @@
       </w:tblGrid>
       <w:tr>
         <w:trPr>
-          <w:trHeight w:val="10085"/>
+          <w:trHeight w:val="9344"/>
         </w:trPr>
         <w:tc>
           <w:tcPr>
@@ -9581,7 +9143,7 @@
 </file>
 
 <file path=word/endnotes.xml><?xml version="1.0" encoding="utf-8"?>
-<w:endnotes xmlns:wpc="http://schemas.microsoft.com/office/word/2010/wordprocessingCanvas" xmlns:cx="http://schemas.microsoft.com/office/drawing/2014/chartex" xmlns:cx1="http://schemas.microsoft.com/office/drawing/2015/9/8/chartex" xmlns:cx2="http://schemas.microsoft.com/office/drawing/2015/10/21/chartex" xmlns:cx3="http://schemas.microsoft.com/office/drawing/2016/5/9/chartex" xmlns:cx4="http://schemas.microsoft.com/office/drawing/2016/5/10/chartex" xmlns:cx5="http://schemas.microsoft.com/office/drawing/2016/5/11/chartex" xmlns:cx6="http://schemas.microsoft.com/office/drawing/2016/5/12/chartex" xmlns:cx7="http://schemas.microsoft.com/office/drawing/2016/5/13/chartex" xmlns:cx8="http://schemas.microsoft.com/office/drawing/2016/5/14/chartex" xmlns:mc="http://schemas.openxmlformats.org/markup-compatibility/2006" xmlns:aink="http://schemas.microsoft.com/office/drawing/2016/ink" xmlns:am3d="http://schemas.microsoft.com/office/drawing/2017/model3d" xmlns:o="urn:schemas-microsoft-com:office:office" xmlns:r="http://schemas.openxmlformats.org/officeDocument/2006/relationships" xmlns:m="http://schemas.openxmlformats.org/officeDocument/2006/math" xmlns:v="urn:schemas-microsoft-com:vml" xmlns:wp14="http://schemas.microsoft.com/office/word/2010/wordprocessingDrawing" xmlns:wp="http://schemas.openxmlformats.org/drawingml/2006/wordprocessingDrawing" xmlns:w10="urn:schemas-microsoft-com:office:word" xmlns:w="http://schemas.openxmlformats.org/wordprocessingml/2006/main" xmlns:w14="http://schemas.microsoft.com/office/word/2010/wordml" xmlns:w15="http://schemas.microsoft.com/office/word/2012/wordml" xmlns:w16cid="http://schemas.microsoft.com/office/word/2016/wordml/cid" xmlns:w16se="http://schemas.microsoft.com/office/word/2015/wordml/symex" xmlns:wpg="http://schemas.microsoft.com/office/word/2010/wordprocessingGroup" xmlns:wpi="http://schemas.microsoft.com/office/word/2010/wordprocessingInk" xmlns:wne="http://schemas.microsoft.com/office/word/2006/wordml" xmlns:wps="http://schemas.microsoft.com/office/word/2010/wordprocessingShape" mc:Ignorable="w14 w15 w16se w16cid wp14">
+<w:endnotes xmlns:wpc="http://schemas.microsoft.com/office/word/2010/wordprocessingCanvas" xmlns:cx="http://schemas.microsoft.com/office/drawing/2014/chartex" xmlns:cx1="http://schemas.microsoft.com/office/drawing/2015/9/8/chartex" xmlns:cx2="http://schemas.microsoft.com/office/drawing/2015/10/21/chartex" xmlns:cx3="http://schemas.microsoft.com/office/drawing/2016/5/9/chartex" xmlns:cx4="http://schemas.microsoft.com/office/drawing/2016/5/10/chartex" xmlns:cx5="http://schemas.microsoft.com/office/drawing/2016/5/11/chartex" xmlns:cx6="http://schemas.microsoft.com/office/drawing/2016/5/12/chartex" xmlns:cx7="http://schemas.microsoft.com/office/drawing/2016/5/13/chartex" xmlns:cx8="http://schemas.microsoft.com/office/drawing/2016/5/14/chartex" xmlns:mc="http://schemas.openxmlformats.org/markup-compatibility/2006" xmlns:aink="http://schemas.microsoft.com/office/drawing/2016/ink" xmlns:am3d="http://schemas.microsoft.com/office/drawing/2017/model3d" xmlns:o="urn:schemas-microsoft-com:office:office" xmlns:oel="http://schemas.microsoft.com/office/2019/extlst" xmlns:r="http://schemas.openxmlformats.org/officeDocument/2006/relationships" xmlns:m="http://schemas.openxmlformats.org/officeDocument/2006/math" xmlns:v="urn:schemas-microsoft-com:vml" xmlns:wp14="http://schemas.microsoft.com/office/word/2010/wordprocessingDrawing" xmlns:wp="http://schemas.openxmlformats.org/drawingml/2006/wordprocessingDrawing" xmlns:w10="urn:schemas-microsoft-com:office:word" xmlns:w="http://schemas.openxmlformats.org/wordprocessingml/2006/main" xmlns:w14="http://schemas.microsoft.com/office/word/2010/wordml" xmlns:w15="http://schemas.microsoft.com/office/word/2012/wordml" xmlns:w16cex="http://schemas.microsoft.com/office/word/2018/wordml/cex" xmlns:w16cid="http://schemas.microsoft.com/office/word/2016/wordml/cid" xmlns:w16="http://schemas.microsoft.com/office/word/2018/wordml" xmlns:w16du="http://schemas.microsoft.com/office/word/2023/wordml/word16du" xmlns:w16sdtdh="http://schemas.microsoft.com/office/word/2020/wordml/sdtdatahash" xmlns:w16sdtfl="http://schemas.microsoft.com/office/word/2024/wordml/sdtformatlock" xmlns:w16se="http://schemas.microsoft.com/office/word/2015/wordml/symex" xmlns:wpg="http://schemas.microsoft.com/office/word/2010/wordprocessingGroup" xmlns:wpi="http://schemas.microsoft.com/office/word/2010/wordprocessingInk" xmlns:wne="http://schemas.microsoft.com/office/word/2006/wordml" xmlns:wps="http://schemas.microsoft.com/office/word/2010/wordprocessingShape" mc:Ignorable="w14 w15 w16se w16cid w16 w16cex w16sdtdh w16sdtfl w16du wp14">
   <w:endnote w:type="separator" w:id="-1">
     <w:p>
       <w:r>
@@ -9600,7 +9162,7 @@
 </file>
 
 <file path=word/footnotes.xml><?xml version="1.0" encoding="utf-8"?>
-<w:footnotes xmlns:wpc="http://schemas.microsoft.com/office/word/2010/wordprocessingCanvas" xmlns:cx="http://schemas.microsoft.com/office/drawing/2014/chartex" xmlns:cx1="http://schemas.microsoft.com/office/drawing/2015/9/8/chartex" xmlns:cx2="http://schemas.microsoft.com/office/drawing/2015/10/21/chartex" xmlns:cx3="http://schemas.microsoft.com/office/drawing/2016/5/9/chartex" xmlns:cx4="http://schemas.microsoft.com/office/drawing/2016/5/10/chartex" xmlns:cx5="http://schemas.microsoft.com/office/drawing/2016/5/11/chartex" xmlns:cx6="http://schemas.microsoft.com/office/drawing/2016/5/12/chartex" xmlns:cx7="http://schemas.microsoft.com/office/drawing/2016/5/13/chartex" xmlns:cx8="http://schemas.microsoft.com/office/drawing/2016/5/14/chartex" xmlns:mc="http://schemas.openxmlformats.org/markup-compatibility/2006" xmlns:aink="http://schemas.microsoft.com/office/drawing/2016/ink" xmlns:am3d="http://schemas.microsoft.com/office/drawing/2017/model3d" xmlns:o="urn:schemas-microsoft-com:office:office" xmlns:r="http://schemas.openxmlformats.org/officeDocument/2006/relationships" xmlns:m="http://schemas.openxmlformats.org/officeDocument/2006/math" xmlns:v="urn:schemas-microsoft-com:vml" xmlns:wp14="http://schemas.microsoft.com/office/word/2010/wordprocessingDrawing" xmlns:wp="http://schemas.openxmlformats.org/drawingml/2006/wordprocessingDrawing" xmlns:w10="urn:schemas-microsoft-com:office:word" xmlns:w="http://schemas.openxmlformats.org/wordprocessingml/2006/main" xmlns:w14="http://schemas.microsoft.com/office/word/2010/wordml" xmlns:w15="http://schemas.microsoft.com/office/word/2012/wordml" xmlns:w16cid="http://schemas.microsoft.com/office/word/2016/wordml/cid" xmlns:w16se="http://schemas.microsoft.com/office/word/2015/wordml/symex" xmlns:wpg="http://schemas.microsoft.com/office/word/2010/wordprocessingGroup" xmlns:wpi="http://schemas.microsoft.com/office/word/2010/wordprocessingInk" xmlns:wne="http://schemas.microsoft.com/office/word/2006/wordml" xmlns:wps="http://schemas.microsoft.com/office/word/2010/wordprocessingShape" mc:Ignorable="w14 w15 w16se w16cid wp14">
+<w:footnotes xmlns:wpc="http://schemas.microsoft.com/office/word/2010/wordprocessingCanvas" xmlns:cx="http://schemas.microsoft.com/office/drawing/2014/chartex" xmlns:cx1="http://schemas.microsoft.com/office/drawing/2015/9/8/chartex" xmlns:cx2="http://schemas.microsoft.com/office/drawing/2015/10/21/chartex" xmlns:cx3="http://schemas.microsoft.com/office/drawing/2016/5/9/chartex" xmlns:cx4="http://schemas.microsoft.com/office/drawing/2016/5/10/chartex" xmlns:cx5="http://schemas.microsoft.com/office/drawing/2016/5/11/chartex" xmlns:cx6="http://schemas.microsoft.com/office/drawing/2016/5/12/chartex" xmlns:cx7="http://schemas.microsoft.com/office/drawing/2016/5/13/chartex" xmlns:cx8="http://schemas.microsoft.com/office/drawing/2016/5/14/chartex" xmlns:mc="http://schemas.openxmlformats.org/markup-compatibility/2006" xmlns:aink="http://schemas.microsoft.com/office/drawing/2016/ink" xmlns:am3d="http://schemas.microsoft.com/office/drawing/2017/model3d" xmlns:o="urn:schemas-microsoft-com:office:office" xmlns:oel="http://schemas.microsoft.com/office/2019/extlst" xmlns:r="http://schemas.openxmlformats.org/officeDocument/2006/relationships" xmlns:m="http://schemas.openxmlformats.org/officeDocument/2006/math" xmlns:v="urn:schemas-microsoft-com:vml" xmlns:wp14="http://schemas.microsoft.com/office/word/2010/wordprocessingDrawing" xmlns:wp="http://schemas.openxmlformats.org/drawingml/2006/wordprocessingDrawing" xmlns:w10="urn:schemas-microsoft-com:office:word" xmlns:w="http://schemas.openxmlformats.org/wordprocessingml/2006/main" xmlns:w14="http://schemas.microsoft.com/office/word/2010/wordml" xmlns:w15="http://schemas.microsoft.com/office/word/2012/wordml" xmlns:w16cex="http://schemas.microsoft.com/office/word/2018/wordml/cex" xmlns:w16cid="http://schemas.microsoft.com/office/word/2016/wordml/cid" xmlns:w16="http://schemas.microsoft.com/office/word/2018/wordml" xmlns:w16du="http://schemas.microsoft.com/office/word/2023/wordml/word16du" xmlns:w16sdtdh="http://schemas.microsoft.com/office/word/2020/wordml/sdtdatahash" xmlns:w16sdtfl="http://schemas.microsoft.com/office/word/2024/wordml/sdtformatlock" xmlns:w16se="http://schemas.microsoft.com/office/word/2015/wordml/symex" xmlns:wpg="http://schemas.microsoft.com/office/word/2010/wordprocessingGroup" xmlns:wpi="http://schemas.microsoft.com/office/word/2010/wordprocessingInk" xmlns:wne="http://schemas.microsoft.com/office/word/2006/wordml" xmlns:wps="http://schemas.microsoft.com/office/word/2010/wordprocessingShape" mc:Ignorable="w14 w15 w16se w16cid w16 w16cex w16sdtdh w16sdtfl w16du wp14">
   <w:footnote w:type="separator" w:id="-1">
     <w:p>
       <w:r>
@@ -9619,7 +9181,7 @@
 </file>
 
 <file path=word/numbering.xml><?xml version="1.0" encoding="utf-8"?>
-<w:numbering xmlns:wpc="http://schemas.microsoft.com/office/word/2010/wordprocessingCanvas" xmlns:cx="http://schemas.microsoft.com/office/drawing/2014/chartex" xmlns:cx1="http://schemas.microsoft.com/office/drawing/2015/9/8/chartex" xmlns:cx2="http://schemas.microsoft.com/office/drawing/2015/10/21/chartex" xmlns:cx3="http://schemas.microsoft.com/office/drawing/2016/5/9/chartex" xmlns:cx4="http://schemas.microsoft.com/office/drawing/2016/5/10/chartex" xmlns:cx5="http://schemas.microsoft.com/office/drawing/2016/5/11/chartex" xmlns:cx6="http://schemas.microsoft.com/office/drawing/2016/5/12/chartex" xmlns:cx7="http://schemas.microsoft.com/office/drawing/2016/5/13/chartex" xmlns:cx8="http://schemas.microsoft.com/office/drawing/2016/5/14/chartex" xmlns:mc="http://schemas.openxmlformats.org/markup-compatibility/2006" xmlns:aink="http://schemas.microsoft.com/office/drawing/2016/ink" xmlns:am3d="http://schemas.microsoft.com/office/drawing/2017/model3d" xmlns:o="urn:schemas-microsoft-com:office:office" xmlns:r="http://schemas.openxmlformats.org/officeDocument/2006/relationships" xmlns:m="http://schemas.openxmlformats.org/officeDocument/2006/math" xmlns:v="urn:schemas-microsoft-com:vml" xmlns:wp14="http://schemas.microsoft.com/office/word/2010/wordprocessingDrawing" xmlns:wp="http://schemas.openxmlformats.org/drawingml/2006/wordprocessingDrawing" xmlns:w10="urn:schemas-microsoft-com:office:word" xmlns:w="http://schemas.openxmlformats.org/wordprocessingml/2006/main" xmlns:w14="http://schemas.microsoft.com/office/word/2010/wordml" xmlns:w15="http://schemas.microsoft.com/office/word/2012/wordml" xmlns:w16cid="http://schemas.microsoft.com/office/word/2016/wordml/cid" xmlns:w16se="http://schemas.microsoft.com/office/word/2015/wordml/symex" xmlns:wpg="http://schemas.microsoft.com/office/word/2010/wordprocessingGroup" xmlns:wpi="http://schemas.microsoft.com/office/word/2010/wordprocessingInk" xmlns:wne="http://schemas.microsoft.com/office/word/2006/wordml" xmlns:wps="http://schemas.microsoft.com/office/word/2010/wordprocessingShape" mc:Ignorable="w14 w15 w16se w16cid wp14">
+<w:numbering xmlns:wpc="http://schemas.microsoft.com/office/word/2010/wordprocessingCanvas" xmlns:cx="http://schemas.microsoft.com/office/drawing/2014/chartex" xmlns:cx1="http://schemas.microsoft.com/office/drawing/2015/9/8/chartex" xmlns:cx2="http://schemas.microsoft.com/office/drawing/2015/10/21/chartex" xmlns:cx3="http://schemas.microsoft.com/office/drawing/2016/5/9/chartex" xmlns:cx4="http://schemas.microsoft.com/office/drawing/2016/5/10/chartex" xmlns:cx5="http://schemas.microsoft.com/office/drawing/2016/5/11/chartex" xmlns:cx6="http://schemas.microsoft.com/office/drawing/2016/5/12/chartex" xmlns:cx7="http://schemas.microsoft.com/office/drawing/2016/5/13/chartex" xmlns:cx8="http://schemas.microsoft.com/office/drawing/2016/5/14/chartex" xmlns:mc="http://schemas.openxmlformats.org/markup-compatibility/2006" xmlns:aink="http://schemas.microsoft.com/office/drawing/2016/ink" xmlns:am3d="http://schemas.microsoft.com/office/drawing/2017/model3d" xmlns:o="urn:schemas-microsoft-com:office:office" xmlns:oel="http://schemas.microsoft.com/office/2019/extlst" xmlns:r="http://schemas.openxmlformats.org/officeDocument/2006/relationships" xmlns:m="http://schemas.openxmlformats.org/officeDocument/2006/math" xmlns:v="urn:schemas-microsoft-com:vml" xmlns:wp14="http://schemas.microsoft.com/office/word/2010/wordprocessingDrawing" xmlns:wp="http://schemas.openxmlformats.org/drawingml/2006/wordprocessingDrawing" xmlns:w10="urn:schemas-microsoft-com:office:word" xmlns:w="http://schemas.openxmlformats.org/wordprocessingml/2006/main" xmlns:w14="http://schemas.microsoft.com/office/word/2010/wordml" xmlns:w15="http://schemas.microsoft.com/office/word/2012/wordml" xmlns:w16cex="http://schemas.microsoft.com/office/word/2018/wordml/cex" xmlns:w16cid="http://schemas.microsoft.com/office/word/2016/wordml/cid" xmlns:w16="http://schemas.microsoft.com/office/word/2018/wordml" xmlns:w16du="http://schemas.microsoft.com/office/word/2023/wordml/word16du" xmlns:w16sdtdh="http://schemas.microsoft.com/office/word/2020/wordml/sdtdatahash" xmlns:w16sdtfl="http://schemas.microsoft.com/office/word/2024/wordml/sdtformatlock" xmlns:w16se="http://schemas.microsoft.com/office/word/2015/wordml/symex" xmlns:wpg="http://schemas.microsoft.com/office/word/2010/wordprocessingGroup" xmlns:wpi="http://schemas.microsoft.com/office/word/2010/wordprocessingInk" xmlns:wne="http://schemas.microsoft.com/office/word/2006/wordml" xmlns:wps="http://schemas.microsoft.com/office/word/2010/wordprocessingShape" mc:Ignorable="w14 w15 w16se w16cid w16 w16cex w16sdtdh w16sdtfl w16du wp14">
   <w:abstractNum w:abstractNumId="0" w15:restartNumberingAfterBreak="0">
     <w:nsid w:val="113E38C6"/>
     <w:multiLevelType w:val="hybridMultilevel"/>
@@ -10460,32 +10022,32 @@
       </w:rPr>
     </w:lvl>
   </w:abstractNum>
-  <w:num w:numId="1">
+  <w:num w:numId="1" w16cid:durableId="1600258150">
     <w:abstractNumId w:val="5"/>
   </w:num>
-  <w:num w:numId="2">
+  <w:num w:numId="2" w16cid:durableId="703599762">
     <w:abstractNumId w:val="2"/>
   </w:num>
-  <w:num w:numId="3">
+  <w:num w:numId="3" w16cid:durableId="836698309">
     <w:abstractNumId w:val="0"/>
   </w:num>
-  <w:num w:numId="4">
+  <w:num w:numId="4" w16cid:durableId="329795222">
     <w:abstractNumId w:val="3"/>
   </w:num>
-  <w:num w:numId="5">
+  <w:num w:numId="5" w16cid:durableId="2029061963">
     <w:abstractNumId w:val="1"/>
   </w:num>
-  <w:num w:numId="6">
+  <w:num w:numId="6" w16cid:durableId="238901733">
     <w:abstractNumId w:val="4"/>
   </w:num>
-  <w:num w:numId="7">
+  <w:num w:numId="7" w16cid:durableId="267004292">
     <w:abstractNumId w:val="6"/>
   </w:num>
 </w:numbering>
 </file>
 
 <file path=word/styles.xml><?xml version="1.0" encoding="utf-8"?>
-<w:styles xmlns:mc="http://schemas.openxmlformats.org/markup-compatibility/2006" xmlns:r="http://schemas.openxmlformats.org/officeDocument/2006/relationships" xmlns:w="http://schemas.openxmlformats.org/wordprocessingml/2006/main" xmlns:w14="http://schemas.microsoft.com/office/word/2010/wordml" xmlns:w15="http://schemas.microsoft.com/office/word/2012/wordml" xmlns:w16cid="http://schemas.microsoft.com/office/word/2016/wordml/cid" xmlns:w16se="http://schemas.microsoft.com/office/word/2015/wordml/symex" mc:Ignorable="w14 w15 w16se w16cid">
+<w:styles xmlns:mc="http://schemas.openxmlformats.org/markup-compatibility/2006" xmlns:r="http://schemas.openxmlformats.org/officeDocument/2006/relationships" xmlns:w="http://schemas.openxmlformats.org/wordprocessingml/2006/main" xmlns:w14="http://schemas.microsoft.com/office/word/2010/wordml" xmlns:w15="http://schemas.microsoft.com/office/word/2012/wordml" xmlns:w16cex="http://schemas.microsoft.com/office/word/2018/wordml/cex" xmlns:w16cid="http://schemas.microsoft.com/office/word/2016/wordml/cid" xmlns:w16="http://schemas.microsoft.com/office/word/2018/wordml" xmlns:w16du="http://schemas.microsoft.com/office/word/2023/wordml/word16du" xmlns:w16sdtdh="http://schemas.microsoft.com/office/word/2020/wordml/sdtdatahash" xmlns:w16sdtfl="http://schemas.microsoft.com/office/word/2024/wordml/sdtformatlock" xmlns:w16se="http://schemas.microsoft.com/office/word/2015/wordml/symex" mc:Ignorable="w14 w15 w16se w16cid w16 w16cex w16sdtdh w16sdtfl w16du">
   <w:docDefaults>
     <w:rPrDefault>
       <w:rPr>
@@ -10503,7 +10065,7 @@
       </w:pPr>
     </w:pPrDefault>
   </w:docDefaults>
-  <w:latentStyles w:defLockedState="0" w:defUIPriority="99" w:defSemiHidden="0" w:defUnhideWhenUsed="0" w:defQFormat="0" w:count="375">
+  <w:latentStyles w:defLockedState="0" w:defUIPriority="99" w:defSemiHidden="0" w:defUnhideWhenUsed="0" w:defQFormat="0" w:count="376">
     <w:lsdException w:name="Normal" w:uiPriority="0" w:qFormat="1"/>
     <w:lsdException w:name="heading 1" w:uiPriority="9" w:qFormat="1"/>
     <w:lsdException w:name="heading 2" w:semiHidden="1" w:uiPriority="9" w:unhideWhenUsed="1" w:qFormat="1"/>
@@ -10879,6 +10441,7 @@
     <w:lsdException w:name="Smart Hyperlink" w:semiHidden="1" w:unhideWhenUsed="1"/>
     <w:lsdException w:name="Hashtag" w:semiHidden="1" w:unhideWhenUsed="1"/>
     <w:lsdException w:name="Unresolved Mention" w:semiHidden="1" w:unhideWhenUsed="1"/>
+    <w:lsdException w:name="Smart Link" w:semiHidden="1" w:unhideWhenUsed="1"/>
   </w:latentStyles>
   <w:style w:type="paragraph" w:default="1" w:styleId="Normal">
     <w:name w:val="Normal"/>
@@ -11815,7 +11378,34 @@
       </a:bgFillStyleLst>
     </a:fmtScheme>
   </a:themeElements>
-  <a:objectDefaults/>
+  <a:objectDefaults>
+    <a:txDef>
+      <a:spPr>
+        <a:solidFill>
+          <a:schemeClr val="lt1"/>
+        </a:solidFill>
+        <a:ln w="6350">
+          <a:noFill/>
+        </a:ln>
+        <a:extLst>
+          <a:ext uri="{91240B29-F687-4F45-9708-019B960494DF}">
+            <a14:hiddenLine xmlns:a14="http://schemas.microsoft.com/office/drawing/2010/main" w="6350">
+              <a:solidFill>
+                <a:prstClr val="black"/>
+              </a:solidFill>
+            </a14:hiddenLine>
+          </a:ext>
+        </a:extLst>
+      </a:spPr>
+      <a:bodyPr rot="0" spcFirstLastPara="0" vertOverflow="overflow" horzOverflow="overflow" vert="horz" wrap="square" lIns="91440" tIns="45720" rIns="91440" bIns="45720" numCol="1" spcCol="0" rtlCol="0" fromWordArt="0" anchor="t" anchorCtr="0" forceAA="0" compatLnSpc="1">
+        <a:prstTxWarp prst="textNoShape">
+          <a:avLst/>
+        </a:prstTxWarp>
+        <a:noAutofit/>
+      </a:bodyPr>
+      <a:lstStyle/>
+    </a:txDef>
+  </a:objectDefaults>
   <a:extraClrSchemeLst/>
   <a:extLst>
     <a:ext uri="{05A4C25C-085E-4340-85A3-A5531E510DB2}">

</xml_diff>

<commit_message>
Version Con modificaciones en los formularios
</commit_message>
<xml_diff>
--- a/doc/individual.docx
+++ b/doc/individual.docx
@@ -1262,7 +1262,7 @@
                           <w:tbl>
                             <w:tblPr>
                               <w:tblStyle w:val="TableNormal"/>
-                              <w:tblW w:w="4986" w:type="pct"/>
+                              <w:tblW w:w="4979" w:type="pct"/>
                               <w:jc w:val="center"/>
                               <w:tblBorders>
                                 <w:top w:val="single" w:sz="4" w:space="0" w:color="000000"/>
@@ -1275,9 +1275,9 @@
                               <w:tblLook w:val="01E0" w:firstRow="1" w:lastRow="1" w:firstColumn="1" w:lastColumn="1" w:noHBand="0" w:noVBand="0"/>
                             </w:tblPr>
                             <w:tblGrid>
-                              <w:gridCol w:w="3252"/>
-                              <w:gridCol w:w="3973"/>
-                              <w:gridCol w:w="3789"/>
+                              <w:gridCol w:w="3248"/>
+                              <w:gridCol w:w="3967"/>
+                              <w:gridCol w:w="3784"/>
                             </w:tblGrid>
                             <w:tr>
                               <w:trPr>
@@ -1443,25 +1443,7 @@
                                       <w:sz w:val="18"/>
                                       <w:szCs w:val="18"/>
                                     </w:rPr>
-                                    <w:t>{</w:t>
-                                  </w:r>
-                                  <w:proofErr w:type="spellStart"/>
-                                  <w:r>
-                                    <w:rPr>
-                                      <w:rFonts w:ascii="Arial" w:hAnsi="Arial" w:cs="Arial"/>
-                                      <w:sz w:val="18"/>
-                                      <w:szCs w:val="18"/>
-                                    </w:rPr>
-                                    <w:t>Nombresc</w:t>
-                                  </w:r>
-                                  <w:proofErr w:type="spellEnd"/>
-                                  <w:r>
-                                    <w:rPr>
-                                      <w:rFonts w:ascii="Arial" w:hAnsi="Arial" w:cs="Arial"/>
-                                      <w:sz w:val="18"/>
-                                      <w:szCs w:val="18"/>
-                                    </w:rPr>
-                                    <w:t>}</w:t>
+                                    <w:t>{Nombresc}</w:t>
                                   </w:r>
                                 </w:p>
                               </w:tc>
@@ -1508,7 +1490,7 @@
                                       <w:sz w:val="18"/>
                                       <w:szCs w:val="18"/>
                                     </w:rPr>
-                                    <w:t>Alex León T.</w:t>
+                                    <w:t xml:space="preserve">Jefferson Villarreal </w:t>
                                   </w:r>
                                 </w:p>
                               </w:tc>
@@ -1554,7 +1536,7 @@
                                       <w:sz w:val="18"/>
                                       <w:szCs w:val="18"/>
                                     </w:rPr>
-                                    <w:t xml:space="preserve"> Villarreal Enriquez Jefferson Edgar</w:t>
+                                    <w:t>Alex León T.</w:t>
                                   </w:r>
                                 </w:p>
                               </w:tc>
@@ -1620,7 +1602,7 @@
                                       <w:sz w:val="18"/>
                                       <w:szCs w:val="18"/>
                                     </w:rPr>
-                                    <w:t>DOCENTE</w:t>
+                                    <w:t>Docente</w:t>
                                   </w:r>
                                 </w:p>
                                 <w:p>
@@ -1671,16 +1653,14 @@
                                     </w:rPr>
                                     <w:t xml:space="preserve"> </w:t>
                                   </w:r>
-                                  <w:proofErr w:type="spellStart"/>
                                   <w:r>
                                     <w:rPr>
                                       <w:rFonts w:ascii="Arial" w:hAnsi="Arial" w:cs="Arial"/>
                                       <w:sz w:val="18"/>
                                       <w:szCs w:val="18"/>
                                     </w:rPr>
-                                    <w:t>Vicerreptor</w:t>
+                                    <w:t>Gestor de Procesos Académicos</w:t>
                                   </w:r>
-                                  <w:proofErr w:type="spellEnd"/>
                                 </w:p>
                               </w:tc>
                               <w:tc>
@@ -1721,10 +1701,19 @@
                                   <w:r>
                                     <w:rPr>
                                       <w:rFonts w:ascii="Arial" w:hAnsi="Arial" w:cs="Arial"/>
+                                      <w:bCs/>
                                       <w:sz w:val="18"/>
                                       <w:szCs w:val="18"/>
                                     </w:rPr>
-                                    <w:t>Gestor De Procesos Académicos</w:t>
+                                    <w:t>V</w:t>
+                                  </w:r>
+                                  <w:r>
+                                    <w:rPr>
+                                      <w:rFonts w:ascii="Arial" w:hAnsi="Arial" w:cs="Arial"/>
+                                      <w:sz w:val="18"/>
+                                      <w:szCs w:val="18"/>
+                                    </w:rPr>
+                                    <w:t>icerrector</w:t>
                                   </w:r>
                                 </w:p>
                               </w:tc>
@@ -1760,7 +1749,7 @@
                     <w:tbl>
                       <w:tblPr>
                         <w:tblStyle w:val="TableNormal"/>
-                        <w:tblW w:w="4986" w:type="pct"/>
+                        <w:tblW w:w="4979" w:type="pct"/>
                         <w:jc w:val="center"/>
                         <w:tblBorders>
                           <w:top w:val="single" w:sz="4" w:space="0" w:color="000000"/>
@@ -1773,9 +1762,9 @@
                         <w:tblLook w:val="01E0" w:firstRow="1" w:lastRow="1" w:firstColumn="1" w:lastColumn="1" w:noHBand="0" w:noVBand="0"/>
                       </w:tblPr>
                       <w:tblGrid>
-                        <w:gridCol w:w="3252"/>
-                        <w:gridCol w:w="3973"/>
-                        <w:gridCol w:w="3789"/>
+                        <w:gridCol w:w="3248"/>
+                        <w:gridCol w:w="3967"/>
+                        <w:gridCol w:w="3784"/>
                       </w:tblGrid>
                       <w:tr>
                         <w:trPr>
@@ -1941,25 +1930,7 @@
                                 <w:sz w:val="18"/>
                                 <w:szCs w:val="18"/>
                               </w:rPr>
-                              <w:t>{</w:t>
-                            </w:r>
-                            <w:proofErr w:type="spellStart"/>
-                            <w:r>
-                              <w:rPr>
-                                <w:rFonts w:ascii="Arial" w:hAnsi="Arial" w:cs="Arial"/>
-                                <w:sz w:val="18"/>
-                                <w:szCs w:val="18"/>
-                              </w:rPr>
-                              <w:t>Nombresc</w:t>
-                            </w:r>
-                            <w:proofErr w:type="spellEnd"/>
-                            <w:r>
-                              <w:rPr>
-                                <w:rFonts w:ascii="Arial" w:hAnsi="Arial" w:cs="Arial"/>
-                                <w:sz w:val="18"/>
-                                <w:szCs w:val="18"/>
-                              </w:rPr>
-                              <w:t>}</w:t>
+                              <w:t>{Nombresc}</w:t>
                             </w:r>
                           </w:p>
                         </w:tc>
@@ -2006,7 +1977,7 @@
                                 <w:sz w:val="18"/>
                                 <w:szCs w:val="18"/>
                               </w:rPr>
-                              <w:t>Alex León T.</w:t>
+                              <w:t xml:space="preserve">Jefferson Villarreal </w:t>
                             </w:r>
                           </w:p>
                         </w:tc>
@@ -2052,7 +2023,7 @@
                                 <w:sz w:val="18"/>
                                 <w:szCs w:val="18"/>
                               </w:rPr>
-                              <w:t xml:space="preserve"> Villarreal Enriquez Jefferson Edgar</w:t>
+                              <w:t>Alex León T.</w:t>
                             </w:r>
                           </w:p>
                         </w:tc>
@@ -2118,7 +2089,7 @@
                                 <w:sz w:val="18"/>
                                 <w:szCs w:val="18"/>
                               </w:rPr>
-                              <w:t>DOCENTE</w:t>
+                              <w:t>Docente</w:t>
                             </w:r>
                           </w:p>
                           <w:p>
@@ -2169,16 +2140,14 @@
                               </w:rPr>
                               <w:t xml:space="preserve"> </w:t>
                             </w:r>
-                            <w:proofErr w:type="spellStart"/>
                             <w:r>
                               <w:rPr>
                                 <w:rFonts w:ascii="Arial" w:hAnsi="Arial" w:cs="Arial"/>
                                 <w:sz w:val="18"/>
                                 <w:szCs w:val="18"/>
                               </w:rPr>
-                              <w:t>Vicerreptor</w:t>
+                              <w:t>Gestor de Procesos Académicos</w:t>
                             </w:r>
-                            <w:proofErr w:type="spellEnd"/>
                           </w:p>
                         </w:tc>
                         <w:tc>
@@ -2219,10 +2188,19 @@
                             <w:r>
                               <w:rPr>
                                 <w:rFonts w:ascii="Arial" w:hAnsi="Arial" w:cs="Arial"/>
+                                <w:bCs/>
                                 <w:sz w:val="18"/>
                                 <w:szCs w:val="18"/>
                               </w:rPr>
-                              <w:t>Gestor De Procesos Académicos</w:t>
+                              <w:t>V</w:t>
+                            </w:r>
+                            <w:r>
+                              <w:rPr>
+                                <w:rFonts w:ascii="Arial" w:hAnsi="Arial" w:cs="Arial"/>
+                                <w:sz w:val="18"/>
+                                <w:szCs w:val="18"/>
+                              </w:rPr>
+                              <w:t>icerrector</w:t>
                             </w:r>
                           </w:p>
                         </w:tc>
@@ -2337,23 +2315,7 @@
                 <w:sz w:val="18"/>
                 <w:szCs w:val="18"/>
               </w:rPr>
-              <w:t>{</w:t>
-            </w:r>
-            <w:proofErr w:type="spellStart"/>
-            <w:r>
-              <w:rPr>
-                <w:sz w:val="18"/>
-                <w:szCs w:val="18"/>
-              </w:rPr>
-              <w:t>NombresC</w:t>
-            </w:r>
-            <w:proofErr w:type="spellEnd"/>
-            <w:r>
-              <w:rPr>
-                <w:sz w:val="18"/>
-                <w:szCs w:val="18"/>
-              </w:rPr>
-              <w:t>}</w:t>
+              <w:t>{NombresC}</w:t>
             </w:r>
           </w:p>
         </w:tc>
@@ -2451,23 +2413,7 @@
                 <w:sz w:val="18"/>
                 <w:szCs w:val="18"/>
               </w:rPr>
-              <w:t>{</w:t>
-            </w:r>
-            <w:proofErr w:type="spellStart"/>
-            <w:r>
-              <w:rPr>
-                <w:sz w:val="18"/>
-                <w:szCs w:val="18"/>
-              </w:rPr>
-              <w:t>CarreraDocente</w:t>
-            </w:r>
-            <w:proofErr w:type="spellEnd"/>
-            <w:r>
-              <w:rPr>
-                <w:sz w:val="18"/>
-                <w:szCs w:val="18"/>
-              </w:rPr>
-              <w:t>}</w:t>
+              <w:t>{CarreraDocente}</w:t>
             </w:r>
           </w:p>
         </w:tc>
@@ -4968,21 +4914,7 @@
                     <w:rPr>
                       <w:sz w:val="16"/>
                     </w:rPr>
-                    <w:t xml:space="preserve">Se realiza inmediatamente después de concluir la capacitación y mide el cumplimiento de los objetivos de aprendizaje, el nivel de satisfacción de los participantes, y la aplicabilidad de los conocimientos adquiridos. Se basa en indicadores cuantitativos como la </w:t>
-                  </w:r>
-                  <w:proofErr w:type="gramStart"/>
-                  <w:r>
-                    <w:rPr>
-                      <w:sz w:val="16"/>
-                    </w:rPr>
-                    <w:t>participación activa</w:t>
-                  </w:r>
-                  <w:proofErr w:type="gramEnd"/>
-                  <w:r>
-                    <w:rPr>
-                      <w:sz w:val="16"/>
-                    </w:rPr>
-                    <w:t>, el uso de recursos tecnológicos, y la efectividad de las metodologías</w:t>
+                    <w:t>Se realiza inmediatamente después de concluir la capacitación y mide el cumplimiento de los objetivos de aprendizaje, el nivel de satisfacción de los participantes, y la aplicabilidad de los conocimientos adquiridos. Se basa en indicadores cuantitativos como la participación activa, el uso de recursos tecnológicos, y la efectividad de las metodologías</w:t>
                   </w:r>
                   <w:r>
                     <w:rPr>
@@ -5853,24 +5785,8 @@
                       <w:u w:val="single"/>
                     </w:rPr>
                     <w:tab/>
-                  </w:r>
-                  <w:proofErr w:type="gramStart"/>
-                  <w:r>
-                    <w:rPr>
-                      <w:sz w:val="14"/>
-                      <w:u w:val="single"/>
-                    </w:rPr>
-                    <w:t>Total</w:t>
-                  </w:r>
-                  <w:proofErr w:type="gramEnd"/>
-                  <w:r>
-                    <w:rPr>
-                      <w:sz w:val="14"/>
-                      <w:u w:val="single"/>
-                    </w:rPr>
-                    <w:t xml:space="preserve"> de horas de </w:t>
-                  </w:r>
-                  <w:proofErr w:type="spellStart"/>
+                    <w:t xml:space="preserve">Total de horas de </w:t>
+                  </w:r>
                   <w:r>
                     <w:rPr>
                       <w:spacing w:val="-2"/>
@@ -5879,7 +5795,6 @@
                     </w:rPr>
                     <w:t>capacitacion</w:t>
                   </w:r>
-                  <w:proofErr w:type="spellEnd"/>
                   <w:r>
                     <w:rPr>
                       <w:sz w:val="14"/>
@@ -5997,22 +5912,7 @@
                       <w:u w:val="single"/>
                     </w:rPr>
                     <w:tab/>
-                  </w:r>
-                  <w:proofErr w:type="gramStart"/>
-                  <w:r>
-                    <w:rPr>
-                      <w:sz w:val="14"/>
-                      <w:u w:val="single"/>
-                    </w:rPr>
-                    <w:t>Total</w:t>
-                  </w:r>
-                  <w:proofErr w:type="gramEnd"/>
-                  <w:r>
-                    <w:rPr>
-                      <w:sz w:val="14"/>
-                      <w:u w:val="single"/>
-                    </w:rPr>
-                    <w:t xml:space="preserve"> de horas de capacitaciones </w:t>
+                    <w:t xml:space="preserve">Total de horas de capacitaciones </w:t>
                   </w:r>
                   <w:r>
                     <w:rPr>
@@ -6058,21 +5958,7 @@
                     <w:rPr>
                       <w:sz w:val="14"/>
                     </w:rPr>
-                    <w:t xml:space="preserve">                                                                      </w:t>
-                  </w:r>
-                  <w:proofErr w:type="gramStart"/>
-                  <w:r>
-                    <w:rPr>
-                      <w:sz w:val="14"/>
-                    </w:rPr>
-                    <w:t>Total</w:t>
-                  </w:r>
-                  <w:proofErr w:type="gramEnd"/>
-                  <w:r>
-                    <w:rPr>
-                      <w:sz w:val="14"/>
-                    </w:rPr>
-                    <w:t xml:space="preserve"> de horas de capacitaciones </w:t>
+                    <w:t xml:space="preserve">                                                                      Total de horas de capacitaciones </w:t>
                   </w:r>
                   <w:r>
                     <w:rPr>
@@ -6369,7 +6255,6 @@
                     </w:rPr>
                     <w:t>{/</w:t>
                   </w:r>
-                  <w:proofErr w:type="spellStart"/>
                   <w:r>
                     <w:rPr>
                       <w:rFonts w:ascii="Arial"/>
@@ -6384,16 +6269,7 @@
                       <w:b/>
                       <w:sz w:val="16"/>
                     </w:rPr>
-                    <w:t>a</w:t>
-                  </w:r>
-                  <w:proofErr w:type="spellEnd"/>
-                  <w:r>
-                    <w:rPr>
-                      <w:rFonts w:ascii="Arial"/>
-                      <w:b/>
-                      <w:sz w:val="16"/>
-                    </w:rPr>
-                    <w:t>}</w:t>
+                    <w:t>a}</w:t>
                   </w:r>
                 </w:p>
                 <w:p>
@@ -7225,19 +7101,11 @@
                       <w:sz w:val="14"/>
                     </w:rPr>
                   </w:pPr>
-                  <w:proofErr w:type="spellStart"/>
                   <w:r>
                     <w:rPr>
                       <w:sz w:val="14"/>
                     </w:rPr>
-                    <w:t>N°</w:t>
-                  </w:r>
-                  <w:proofErr w:type="spellEnd"/>
-                  <w:r>
-                    <w:rPr>
-                      <w:sz w:val="14"/>
-                    </w:rPr>
-                    <w:t xml:space="preserve"> de profesoras cuyo máximo título es un grado</w:t>
+                    <w:t>N° de profesoras cuyo máximo título es un grado</w:t>
                   </w:r>
                   <w:r>
                     <w:rPr>
@@ -7415,16 +7283,8 @@
                     <w:rPr>
                       <w:sz w:val="14"/>
                     </w:rPr>
-                    <w:t xml:space="preserve">                                              </w:t>
-                  </w:r>
-                  <w:proofErr w:type="spellStart"/>
-                  <w:r>
-                    <w:rPr>
-                      <w:sz w:val="14"/>
-                    </w:rPr>
-                    <w:t>N°</w:t>
-                  </w:r>
-                  <w:proofErr w:type="spellEnd"/>
+                    <w:t xml:space="preserve">                                              N°</w:t>
+                  </w:r>
                   <w:r>
                     <w:rPr>
                       <w:spacing w:val="-5"/>
@@ -8065,14 +7925,12 @@
                     </w:rPr>
                     <w:t>{</w:t>
                   </w:r>
-                  <w:proofErr w:type="spellStart"/>
                   <w:r>
                     <w:rPr>
                       <w:sz w:val="16"/>
                     </w:rPr>
                     <w:t>NombreFormaciónEspecifica</w:t>
                   </w:r>
-                  <w:proofErr w:type="spellEnd"/>
                   <w:r>
                     <w:rPr>
                       <w:sz w:val="16"/>
@@ -8102,14 +7960,12 @@
                     </w:rPr>
                     <w:t>{</w:t>
                   </w:r>
-                  <w:proofErr w:type="spellStart"/>
                   <w:r>
                     <w:rPr>
                       <w:sz w:val="16"/>
                     </w:rPr>
                     <w:t>NivelFormaciónEspecifica</w:t>
                   </w:r>
-                  <w:proofErr w:type="spellEnd"/>
                   <w:r>
                     <w:rPr>
                       <w:sz w:val="16"/>
@@ -8142,14 +7998,12 @@
                     </w:rPr>
                     <w:t>{</w:t>
                   </w:r>
-                  <w:proofErr w:type="spellStart"/>
                   <w:r>
                     <w:rPr>
                       <w:sz w:val="16"/>
                     </w:rPr>
                     <w:t>FechaInicioE</w:t>
                   </w:r>
-                  <w:proofErr w:type="spellEnd"/>
                   <w:r>
                     <w:rPr>
                       <w:sz w:val="16"/>
@@ -8182,14 +8036,12 @@
                     </w:rPr>
                     <w:t>{</w:t>
                   </w:r>
-                  <w:proofErr w:type="spellStart"/>
                   <w:r>
                     <w:rPr>
                       <w:sz w:val="16"/>
                     </w:rPr>
                     <w:t>FechaFinE</w:t>
                   </w:r>
-                  <w:proofErr w:type="spellEnd"/>
                   <w:r>
                     <w:rPr>
                       <w:sz w:val="16"/>
@@ -8252,14 +8104,12 @@
                     </w:rPr>
                     <w:t>{</w:t>
                   </w:r>
-                  <w:proofErr w:type="spellStart"/>
                   <w:r>
                     <w:rPr>
                       <w:sz w:val="16"/>
                     </w:rPr>
                     <w:t>NombreFormaciónGenerica</w:t>
                   </w:r>
-                  <w:proofErr w:type="spellEnd"/>
                   <w:r>
                     <w:rPr>
                       <w:sz w:val="16"/>
@@ -8292,14 +8142,12 @@
                     </w:rPr>
                     <w:t>{</w:t>
                   </w:r>
-                  <w:proofErr w:type="spellStart"/>
                   <w:r>
                     <w:rPr>
                       <w:sz w:val="16"/>
                     </w:rPr>
                     <w:t>NivelFormaciónGenerica</w:t>
                   </w:r>
-                  <w:proofErr w:type="spellEnd"/>
                   <w:r>
                     <w:rPr>
                       <w:sz w:val="16"/>
@@ -8333,7 +8181,6 @@
                     </w:rPr>
                     <w:t>{</w:t>
                   </w:r>
-                  <w:proofErr w:type="spellStart"/>
                   <w:r>
                     <w:rPr>
                       <w:sz w:val="16"/>
@@ -8344,14 +8191,7 @@
                     <w:rPr>
                       <w:sz w:val="16"/>
                     </w:rPr>
-                    <w:t>G</w:t>
-                  </w:r>
-                  <w:proofErr w:type="spellEnd"/>
-                  <w:r>
-                    <w:rPr>
-                      <w:sz w:val="16"/>
-                    </w:rPr>
-                    <w:t>}</w:t>
+                    <w:t>G}</w:t>
                   </w:r>
                 </w:p>
               </w:tc>
@@ -8380,7 +8220,6 @@
                     </w:rPr>
                     <w:t>{</w:t>
                   </w:r>
-                  <w:proofErr w:type="spellStart"/>
                   <w:r>
                     <w:rPr>
                       <w:sz w:val="16"/>
@@ -8391,14 +8230,7 @@
                     <w:rPr>
                       <w:sz w:val="16"/>
                     </w:rPr>
-                    <w:t>G</w:t>
-                  </w:r>
-                  <w:proofErr w:type="spellEnd"/>
-                  <w:r>
-                    <w:rPr>
-                      <w:sz w:val="16"/>
-                    </w:rPr>
-                    <w:t>}</w:t>
+                    <w:t>G}</w:t>
                   </w:r>
                 </w:p>
               </w:tc>
@@ -10662,7 +10494,6 @@
   <w:style w:type="character" w:default="1" w:styleId="Fuentedeprrafopredeter">
     <w:name w:val="Default Paragraph Font"/>
     <w:uiPriority w:val="1"/>
-    <w:semiHidden/>
     <w:unhideWhenUsed/>
   </w:style>
   <w:style w:type="table" w:default="1" w:styleId="Tablanormal">
@@ -11427,15 +11258,6 @@
 </file>
 
 <file path=customXml/item2.xml><?xml version="1.0" encoding="utf-8"?>
-<?mso-contentType ?>
-<FormTemplates xmlns="http://schemas.microsoft.com/sharepoint/v3/contenttype/forms">
-  <Display>DocumentLibraryForm</Display>
-  <Edit>DocumentLibraryForm</Edit>
-  <New>DocumentLibraryForm</New>
-</FormTemplates>
-</file>
-
-<file path=customXml/item3.xml><?xml version="1.0" encoding="utf-8"?>
 <ct:contentTypeSchema xmlns:ct="http://schemas.microsoft.com/office/2006/metadata/contentType" xmlns:ma="http://schemas.microsoft.com/office/2006/metadata/properties/metaAttributes" ct:_="" ma:_="" ma:contentTypeName="Documento" ma:contentTypeID="0x010100AFCCB6245C987745891279558BDB0B3B" ma:contentTypeVersion="10" ma:contentTypeDescription="Crear nuevo documento." ma:contentTypeScope="" ma:versionID="db2b1ef01224d0e4c869899219de097e">
   <xsd:schema xmlns:xsd="http://www.w3.org/2001/XMLSchema" xmlns:xs="http://www.w3.org/2001/XMLSchema" xmlns:p="http://schemas.microsoft.com/office/2006/metadata/properties" xmlns:ns2="99f51e6f-0b5b-434c-9b36-ed35023571bc" xmlns:ns3="27118ee3-1735-4bf8-b1d8-b92405a04e3d" targetNamespace="http://schemas.microsoft.com/office/2006/metadata/properties" ma:root="true" ma:fieldsID="0535449ddeeed03297b3b93236c6a265" ns2:_="" ns3:_="">
     <xsd:import namespace="99f51e6f-0b5b-434c-9b36-ed35023571bc"/>
@@ -11624,6 +11446,15 @@
 </ct:contentTypeSchema>
 </file>
 
+<file path=customXml/item3.xml><?xml version="1.0" encoding="utf-8"?>
+<?mso-contentType ?>
+<FormTemplates xmlns="http://schemas.microsoft.com/sharepoint/v3/contenttype/forms">
+  <Display>DocumentLibraryForm</Display>
+  <Edit>DocumentLibraryForm</Edit>
+  <New>DocumentLibraryForm</New>
+</FormTemplates>
+</file>
+
 <file path=customXml/itemProps1.xml><?xml version="1.0" encoding="utf-8"?>
 <ds:datastoreItem xmlns:ds="http://schemas.openxmlformats.org/officeDocument/2006/customXml" ds:itemID="{13D1DF26-15E7-4CB8-BF6B-6E5B7C532BE3}">
   <ds:schemaRefs>
@@ -11636,14 +11467,6 @@
 </file>
 
 <file path=customXml/itemProps2.xml><?xml version="1.0" encoding="utf-8"?>
-<ds:datastoreItem xmlns:ds="http://schemas.openxmlformats.org/officeDocument/2006/customXml" ds:itemID="{61A0775B-211E-428E-B3DF-75E37932E561}">
-  <ds:schemaRefs>
-    <ds:schemaRef ds:uri="http://schemas.microsoft.com/sharepoint/v3/contenttype/forms"/>
-  </ds:schemaRefs>
-</ds:datastoreItem>
-</file>
-
-<file path=customXml/itemProps3.xml><?xml version="1.0" encoding="utf-8"?>
 <ds:datastoreItem xmlns:ds="http://schemas.openxmlformats.org/officeDocument/2006/customXml" ds:itemID="{E29BA6FB-B8A3-484B-AAE3-F2BB7F834CDC}">
   <ds:schemaRefs>
     <ds:schemaRef ds:uri="http://schemas.microsoft.com/office/2006/metadata/contentType"/>
@@ -11660,4 +11483,12 @@
     <ds:schemaRef ds:uri="http://schemas.microsoft.com/internal/obd"/>
   </ds:schemaRefs>
 </ds:datastoreItem>
+</file>
+
+<file path=customXml/itemProps3.xml><?xml version="1.0" encoding="utf-8"?>
+<ds:datastoreItem xmlns:ds="http://schemas.openxmlformats.org/officeDocument/2006/customXml" ds:itemID="{61A0775B-211E-428E-B3DF-75E37932E561}">
+  <ds:schemaRefs>
+    <ds:schemaRef ds:uri="http://schemas.microsoft.com/sharepoint/v3/contenttype/forms"/>
+  </ds:schemaRefs>
+</ds:datastoreItem>
 </file>
</xml_diff>